<commit_message>
Atualização dos casos de testes
</commit_message>
<xml_diff>
--- a/docs/Plano_De_Teste.docx
+++ b/docs/Plano_De_Teste.docx
@@ -43,7 +43,7 @@
           <w:sz w:val="24"/>
           <w:szCs w:val="24"/>
         </w:rPr>
-        <w:t>1.0</w:t>
+        <w:t>1.</w:t>
       </w:r>
       <w:r>
         <w:rPr>
@@ -51,25 +51,25 @@
           <w:sz w:val="24"/>
           <w:szCs w:val="24"/>
         </w:rPr>
-        <w:br/>
-      </w:r>
-      <w:r>
-        <w:rPr>
-          <w:rFonts w:ascii="Arial" w:hAnsi="Arial" w:cs="Arial"/>
-          <w:b/>
-          <w:bCs/>
+        <w:t>1</w:t>
+      </w:r>
+      <w:r>
+        <w:rPr>
+          <w:rFonts w:ascii="Arial" w:hAnsi="Arial" w:cs="Arial"/>
           <w:sz w:val="24"/>
           <w:szCs w:val="24"/>
         </w:rPr>
-        <w:t>Data:</w:t>
-      </w:r>
-      <w:r>
-        <w:rPr>
-          <w:rFonts w:ascii="Arial" w:hAnsi="Arial" w:cs="Arial"/>
+        <w:br/>
+      </w:r>
+      <w:r>
+        <w:rPr>
+          <w:rFonts w:ascii="Arial" w:hAnsi="Arial" w:cs="Arial"/>
+          <w:b/>
+          <w:bCs/>
           <w:sz w:val="24"/>
           <w:szCs w:val="24"/>
         </w:rPr>
-        <w:t>28/06/2025</w:t>
+        <w:t>Data:</w:t>
       </w:r>
       <w:r>
         <w:rPr>
@@ -77,17 +77,15 @@
           <w:sz w:val="24"/>
           <w:szCs w:val="24"/>
         </w:rPr>
-        <w:br/>
-      </w:r>
-      <w:r>
-        <w:rPr>
-          <w:rFonts w:ascii="Arial" w:hAnsi="Arial" w:cs="Arial"/>
-          <w:b/>
-          <w:bCs/>
+        <w:t>04</w:t>
+      </w:r>
+      <w:r>
+        <w:rPr>
+          <w:rFonts w:ascii="Arial" w:hAnsi="Arial" w:cs="Arial"/>
           <w:sz w:val="24"/>
           <w:szCs w:val="24"/>
         </w:rPr>
-        <w:t>Responsável</w:t>
+        <w:t>/0</w:t>
       </w:r>
       <w:r>
         <w:rPr>
@@ -95,6 +93,40 @@
           <w:sz w:val="24"/>
           <w:szCs w:val="24"/>
         </w:rPr>
+        <w:t>7</w:t>
+      </w:r>
+      <w:r>
+        <w:rPr>
+          <w:rFonts w:ascii="Arial" w:hAnsi="Arial" w:cs="Arial"/>
+          <w:sz w:val="24"/>
+          <w:szCs w:val="24"/>
+        </w:rPr>
+        <w:t>/2025</w:t>
+      </w:r>
+      <w:r>
+        <w:rPr>
+          <w:rFonts w:ascii="Arial" w:hAnsi="Arial" w:cs="Arial"/>
+          <w:sz w:val="24"/>
+          <w:szCs w:val="24"/>
+        </w:rPr>
+        <w:br/>
+      </w:r>
+      <w:r>
+        <w:rPr>
+          <w:rFonts w:ascii="Arial" w:hAnsi="Arial" w:cs="Arial"/>
+          <w:b/>
+          <w:bCs/>
+          <w:sz w:val="24"/>
+          <w:szCs w:val="24"/>
+        </w:rPr>
+        <w:t>Responsável</w:t>
+      </w:r>
+      <w:r>
+        <w:rPr>
+          <w:rFonts w:ascii="Arial" w:hAnsi="Arial" w:cs="Arial"/>
+          <w:sz w:val="24"/>
+          <w:szCs w:val="24"/>
+        </w:rPr>
         <w:t>: Marcelo Prata Patrício</w:t>
       </w:r>
     </w:p>
@@ -3904,6 +3936,2986 @@
         <w:numPr>
           <w:ilvl w:val="0"/>
           <w:numId w:val="16"/>
+        </w:numPr>
+        <w:jc w:val="both"/>
+        <w:rPr>
+          <w:rFonts w:ascii="Arial" w:hAnsi="Arial" w:cs="Arial"/>
+        </w:rPr>
+      </w:pPr>
+      <w:r>
+        <w:rPr>
+          <w:rFonts w:ascii="Arial" w:hAnsi="Arial" w:cs="Arial"/>
+          <w:b/>
+          <w:bCs/>
+        </w:rPr>
+        <w:t>Melhorias Sugeridas:</w:t>
+      </w:r>
+    </w:p>
+    <w:p>
+      <w:pPr>
+        <w:ind w:left="720"/>
+        <w:jc w:val="both"/>
+        <w:rPr>
+          <w:rFonts w:ascii="Arial" w:hAnsi="Arial" w:cs="Arial"/>
+        </w:rPr>
+      </w:pPr>
+    </w:p>
+    <w:p>
+      <w:pPr>
+        <w:pStyle w:val="Ttulo2"/>
+        <w:rPr>
+          <w:b/>
+          <w:bCs/>
+        </w:rPr>
+      </w:pPr>
+      <w:r>
+        <w:rPr>
+          <w:b/>
+          <w:bCs/>
+        </w:rPr>
+        <w:t>CT11 – Validar campos obrigatórios no cadastro de funcionário</w:t>
+      </w:r>
+    </w:p>
+    <w:p>
+      <w:pPr>
+        <w:numPr>
+          <w:ilvl w:val="0"/>
+          <w:numId w:val="18"/>
+        </w:numPr>
+        <w:jc w:val="both"/>
+        <w:rPr>
+          <w:rFonts w:ascii="Arial" w:hAnsi="Arial" w:cs="Arial"/>
+        </w:rPr>
+      </w:pPr>
+      <w:r>
+        <w:rPr>
+          <w:rFonts w:ascii="Arial" w:hAnsi="Arial" w:cs="Arial"/>
+          <w:b/>
+          <w:bCs/>
+        </w:rPr>
+        <w:t>Objetivo:</w:t>
+      </w:r>
+      <w:r>
+        <w:rPr>
+          <w:rFonts w:ascii="Arial" w:hAnsi="Arial" w:cs="Arial"/>
+        </w:rPr>
+        <w:t xml:space="preserve"> Verificar se o sistema impede o cadastro sem preencher os campos obrigatórios.</w:t>
+      </w:r>
+    </w:p>
+    <w:p>
+      <w:pPr>
+        <w:numPr>
+          <w:ilvl w:val="0"/>
+          <w:numId w:val="18"/>
+        </w:numPr>
+        <w:jc w:val="both"/>
+        <w:rPr>
+          <w:rFonts w:ascii="Arial" w:hAnsi="Arial" w:cs="Arial"/>
+        </w:rPr>
+      </w:pPr>
+      <w:r>
+        <w:rPr>
+          <w:rFonts w:ascii="Arial" w:hAnsi="Arial" w:cs="Arial"/>
+          <w:b/>
+          <w:bCs/>
+        </w:rPr>
+        <w:t>Pré-condições:</w:t>
+      </w:r>
+      <w:r>
+        <w:rPr>
+          <w:rFonts w:ascii="Arial" w:hAnsi="Arial" w:cs="Arial"/>
+        </w:rPr>
+        <w:t xml:space="preserve"> Administrador deve estar logado.</w:t>
+      </w:r>
+    </w:p>
+    <w:p>
+      <w:pPr>
+        <w:numPr>
+          <w:ilvl w:val="0"/>
+          <w:numId w:val="18"/>
+        </w:numPr>
+        <w:jc w:val="both"/>
+        <w:rPr>
+          <w:rFonts w:ascii="Arial" w:hAnsi="Arial" w:cs="Arial"/>
+        </w:rPr>
+      </w:pPr>
+      <w:r>
+        <w:rPr>
+          <w:rFonts w:ascii="Arial" w:hAnsi="Arial" w:cs="Arial"/>
+          <w:b/>
+          <w:bCs/>
+        </w:rPr>
+        <w:t>Entradas:</w:t>
+      </w:r>
+      <w:r>
+        <w:rPr>
+          <w:rFonts w:ascii="Arial" w:hAnsi="Arial" w:cs="Arial"/>
+        </w:rPr>
+        <w:t xml:space="preserve"> Nome e/ou e-mail deixados em branco.</w:t>
+      </w:r>
+    </w:p>
+    <w:p>
+      <w:pPr>
+        <w:numPr>
+          <w:ilvl w:val="0"/>
+          <w:numId w:val="18"/>
+        </w:numPr>
+        <w:jc w:val="both"/>
+        <w:rPr>
+          <w:rFonts w:ascii="Arial" w:hAnsi="Arial" w:cs="Arial"/>
+        </w:rPr>
+      </w:pPr>
+      <w:r>
+        <w:rPr>
+          <w:rFonts w:ascii="Arial" w:hAnsi="Arial" w:cs="Arial"/>
+          <w:b/>
+          <w:bCs/>
+        </w:rPr>
+        <w:t>Passos:</w:t>
+      </w:r>
+    </w:p>
+    <w:p>
+      <w:pPr>
+        <w:numPr>
+          <w:ilvl w:val="1"/>
+          <w:numId w:val="18"/>
+        </w:numPr>
+        <w:jc w:val="both"/>
+        <w:rPr>
+          <w:rFonts w:ascii="Arial" w:hAnsi="Arial" w:cs="Arial"/>
+        </w:rPr>
+      </w:pPr>
+      <w:r>
+        <w:rPr>
+          <w:rFonts w:ascii="Arial" w:hAnsi="Arial" w:cs="Arial"/>
+        </w:rPr>
+        <w:t>Acessar o menu "Funcionários";</w:t>
+      </w:r>
+    </w:p>
+    <w:p>
+      <w:pPr>
+        <w:numPr>
+          <w:ilvl w:val="1"/>
+          <w:numId w:val="18"/>
+        </w:numPr>
+        <w:jc w:val="both"/>
+        <w:rPr>
+          <w:rFonts w:ascii="Arial" w:hAnsi="Arial" w:cs="Arial"/>
+        </w:rPr>
+      </w:pPr>
+      <w:r>
+        <w:rPr>
+          <w:rFonts w:ascii="Arial" w:hAnsi="Arial" w:cs="Arial"/>
+        </w:rPr>
+        <w:t>Clicar em "Novo Funcionário";</w:t>
+      </w:r>
+    </w:p>
+    <w:p>
+      <w:pPr>
+        <w:numPr>
+          <w:ilvl w:val="1"/>
+          <w:numId w:val="18"/>
+        </w:numPr>
+        <w:jc w:val="both"/>
+        <w:rPr>
+          <w:rFonts w:ascii="Arial" w:hAnsi="Arial" w:cs="Arial"/>
+        </w:rPr>
+      </w:pPr>
+      <w:r>
+        <w:rPr>
+          <w:rFonts w:ascii="Arial" w:hAnsi="Arial" w:cs="Arial"/>
+        </w:rPr>
+        <w:t>Deixar campos obrigatórios (nome/e-mail) em branco;</w:t>
+      </w:r>
+    </w:p>
+    <w:p>
+      <w:pPr>
+        <w:numPr>
+          <w:ilvl w:val="1"/>
+          <w:numId w:val="18"/>
+        </w:numPr>
+        <w:jc w:val="both"/>
+        <w:rPr>
+          <w:rFonts w:ascii="Arial" w:hAnsi="Arial" w:cs="Arial"/>
+        </w:rPr>
+      </w:pPr>
+      <w:r>
+        <w:rPr>
+          <w:rFonts w:ascii="Arial" w:hAnsi="Arial" w:cs="Arial"/>
+        </w:rPr>
+        <w:t>Clicar em "Cadastrar".</w:t>
+      </w:r>
+    </w:p>
+    <w:p>
+      <w:pPr>
+        <w:numPr>
+          <w:ilvl w:val="0"/>
+          <w:numId w:val="18"/>
+        </w:numPr>
+        <w:jc w:val="both"/>
+        <w:rPr>
+          <w:rFonts w:ascii="Arial" w:hAnsi="Arial" w:cs="Arial"/>
+        </w:rPr>
+      </w:pPr>
+      <w:r>
+        <w:rPr>
+          <w:rFonts w:ascii="Arial" w:hAnsi="Arial" w:cs="Arial"/>
+          <w:b/>
+          <w:bCs/>
+        </w:rPr>
+        <w:t>Resultado esperado:</w:t>
+      </w:r>
+      <w:r>
+        <w:rPr>
+          <w:rFonts w:ascii="Arial" w:hAnsi="Arial" w:cs="Arial"/>
+        </w:rPr>
+        <w:t xml:space="preserve"> Sistema exibe mensagem de erro e bloqueia o cadastro.</w:t>
+      </w:r>
+    </w:p>
+    <w:p>
+      <w:pPr>
+        <w:numPr>
+          <w:ilvl w:val="0"/>
+          <w:numId w:val="18"/>
+        </w:numPr>
+        <w:jc w:val="both"/>
+        <w:rPr>
+          <w:rFonts w:ascii="Arial" w:hAnsi="Arial" w:cs="Arial"/>
+        </w:rPr>
+      </w:pPr>
+      <w:r>
+        <w:rPr>
+          <w:rFonts w:ascii="Arial" w:hAnsi="Arial" w:cs="Arial"/>
+          <w:b/>
+          <w:bCs/>
+        </w:rPr>
+        <w:t>Responsável pela Execução:</w:t>
+      </w:r>
+    </w:p>
+    <w:p>
+      <w:pPr>
+        <w:numPr>
+          <w:ilvl w:val="0"/>
+          <w:numId w:val="18"/>
+        </w:numPr>
+        <w:jc w:val="both"/>
+        <w:rPr>
+          <w:rFonts w:ascii="Arial" w:hAnsi="Arial" w:cs="Arial"/>
+        </w:rPr>
+      </w:pPr>
+      <w:r>
+        <w:rPr>
+          <w:rFonts w:ascii="Arial" w:hAnsi="Arial" w:cs="Arial"/>
+          <w:b/>
+          <w:bCs/>
+        </w:rPr>
+        <w:t>Resultado Obtido:</w:t>
+      </w:r>
+    </w:p>
+    <w:p>
+      <w:pPr>
+        <w:numPr>
+          <w:ilvl w:val="0"/>
+          <w:numId w:val="18"/>
+        </w:numPr>
+        <w:jc w:val="both"/>
+        <w:rPr>
+          <w:rFonts w:ascii="Arial" w:hAnsi="Arial" w:cs="Arial"/>
+        </w:rPr>
+      </w:pPr>
+      <w:r>
+        <w:rPr>
+          <w:rFonts w:ascii="Arial" w:hAnsi="Arial" w:cs="Arial"/>
+          <w:b/>
+          <w:bCs/>
+        </w:rPr>
+        <w:t>Tempo de Execução:</w:t>
+      </w:r>
+    </w:p>
+    <w:p>
+      <w:pPr>
+        <w:numPr>
+          <w:ilvl w:val="0"/>
+          <w:numId w:val="18"/>
+        </w:numPr>
+        <w:jc w:val="both"/>
+        <w:rPr>
+          <w:rFonts w:ascii="Arial" w:hAnsi="Arial" w:cs="Arial"/>
+        </w:rPr>
+      </w:pPr>
+      <w:r>
+        <w:rPr>
+          <w:rFonts w:ascii="Arial" w:hAnsi="Arial" w:cs="Arial"/>
+          <w:b/>
+          <w:bCs/>
+        </w:rPr>
+        <w:t>Observações:</w:t>
+      </w:r>
+    </w:p>
+    <w:p>
+      <w:pPr>
+        <w:numPr>
+          <w:ilvl w:val="0"/>
+          <w:numId w:val="18"/>
+        </w:numPr>
+        <w:jc w:val="both"/>
+        <w:rPr>
+          <w:rFonts w:ascii="Arial" w:hAnsi="Arial" w:cs="Arial"/>
+        </w:rPr>
+      </w:pPr>
+      <w:r>
+        <w:rPr>
+          <w:rFonts w:ascii="Arial" w:hAnsi="Arial" w:cs="Arial"/>
+          <w:b/>
+          <w:bCs/>
+        </w:rPr>
+        <w:t>Melhorias Sugeridas:</w:t>
+      </w:r>
+    </w:p>
+    <w:p>
+      <w:pPr>
+        <w:jc w:val="both"/>
+        <w:rPr>
+          <w:rFonts w:ascii="Arial" w:hAnsi="Arial" w:cs="Arial"/>
+        </w:rPr>
+      </w:pPr>
+    </w:p>
+    <w:p>
+      <w:pPr>
+        <w:pStyle w:val="Ttulo2"/>
+        <w:rPr>
+          <w:b/>
+          <w:bCs/>
+        </w:rPr>
+      </w:pPr>
+      <w:r>
+        <w:rPr>
+          <w:b/>
+          <w:bCs/>
+        </w:rPr>
+        <w:t>CT12 – Prevenir duplicidade de serviços</w:t>
+      </w:r>
+    </w:p>
+    <w:p>
+      <w:pPr>
+        <w:numPr>
+          <w:ilvl w:val="0"/>
+          <w:numId w:val="19"/>
+        </w:numPr>
+        <w:jc w:val="both"/>
+        <w:rPr>
+          <w:rFonts w:ascii="Arial" w:hAnsi="Arial" w:cs="Arial"/>
+        </w:rPr>
+      </w:pPr>
+      <w:r>
+        <w:rPr>
+          <w:rFonts w:ascii="Arial" w:hAnsi="Arial" w:cs="Arial"/>
+          <w:b/>
+          <w:bCs/>
+        </w:rPr>
+        <w:t>Objetivo:</w:t>
+      </w:r>
+      <w:r>
+        <w:rPr>
+          <w:rFonts w:ascii="Arial" w:hAnsi="Arial" w:cs="Arial"/>
+        </w:rPr>
+        <w:t xml:space="preserve"> Impedir o cadastro de um serviço com nome duplicado.</w:t>
+      </w:r>
+    </w:p>
+    <w:p>
+      <w:pPr>
+        <w:numPr>
+          <w:ilvl w:val="0"/>
+          <w:numId w:val="19"/>
+        </w:numPr>
+        <w:jc w:val="both"/>
+        <w:rPr>
+          <w:rFonts w:ascii="Arial" w:hAnsi="Arial" w:cs="Arial"/>
+        </w:rPr>
+      </w:pPr>
+      <w:r>
+        <w:rPr>
+          <w:rFonts w:ascii="Arial" w:hAnsi="Arial" w:cs="Arial"/>
+          <w:b/>
+          <w:bCs/>
+        </w:rPr>
+        <w:t>Pré-condições:</w:t>
+      </w:r>
+      <w:r>
+        <w:rPr>
+          <w:rFonts w:ascii="Arial" w:hAnsi="Arial" w:cs="Arial"/>
+        </w:rPr>
+        <w:t xml:space="preserve"> Administrador deve estar logado.</w:t>
+      </w:r>
+    </w:p>
+    <w:p>
+      <w:pPr>
+        <w:numPr>
+          <w:ilvl w:val="0"/>
+          <w:numId w:val="19"/>
+        </w:numPr>
+        <w:jc w:val="both"/>
+        <w:rPr>
+          <w:rFonts w:ascii="Arial" w:hAnsi="Arial" w:cs="Arial"/>
+        </w:rPr>
+      </w:pPr>
+      <w:r>
+        <w:rPr>
+          <w:rFonts w:ascii="Arial" w:hAnsi="Arial" w:cs="Arial"/>
+          <w:b/>
+          <w:bCs/>
+        </w:rPr>
+        <w:t>Entradas:</w:t>
+      </w:r>
+      <w:r>
+        <w:rPr>
+          <w:rFonts w:ascii="Arial" w:hAnsi="Arial" w:cs="Arial"/>
+        </w:rPr>
+        <w:t xml:space="preserve"> Nome de serviço já existente.</w:t>
+      </w:r>
+    </w:p>
+    <w:p>
+      <w:pPr>
+        <w:numPr>
+          <w:ilvl w:val="0"/>
+          <w:numId w:val="19"/>
+        </w:numPr>
+        <w:jc w:val="both"/>
+        <w:rPr>
+          <w:rFonts w:ascii="Arial" w:hAnsi="Arial" w:cs="Arial"/>
+        </w:rPr>
+      </w:pPr>
+      <w:r>
+        <w:rPr>
+          <w:rFonts w:ascii="Arial" w:hAnsi="Arial" w:cs="Arial"/>
+          <w:b/>
+          <w:bCs/>
+        </w:rPr>
+        <w:t>Passos:</w:t>
+      </w:r>
+    </w:p>
+    <w:p>
+      <w:pPr>
+        <w:numPr>
+          <w:ilvl w:val="1"/>
+          <w:numId w:val="19"/>
+        </w:numPr>
+        <w:jc w:val="both"/>
+        <w:rPr>
+          <w:rFonts w:ascii="Arial" w:hAnsi="Arial" w:cs="Arial"/>
+        </w:rPr>
+      </w:pPr>
+      <w:r>
+        <w:rPr>
+          <w:rFonts w:ascii="Arial" w:hAnsi="Arial" w:cs="Arial"/>
+        </w:rPr>
+        <w:t>Acessar menu "Serviços";</w:t>
+      </w:r>
+    </w:p>
+    <w:p>
+      <w:pPr>
+        <w:numPr>
+          <w:ilvl w:val="1"/>
+          <w:numId w:val="19"/>
+        </w:numPr>
+        <w:jc w:val="both"/>
+        <w:rPr>
+          <w:rFonts w:ascii="Arial" w:hAnsi="Arial" w:cs="Arial"/>
+        </w:rPr>
+      </w:pPr>
+      <w:r>
+        <w:rPr>
+          <w:rFonts w:ascii="Arial" w:hAnsi="Arial" w:cs="Arial"/>
+        </w:rPr>
+        <w:lastRenderedPageBreak/>
+        <w:t>Clicar em "Novo Serviço";</w:t>
+      </w:r>
+    </w:p>
+    <w:p>
+      <w:pPr>
+        <w:numPr>
+          <w:ilvl w:val="1"/>
+          <w:numId w:val="19"/>
+        </w:numPr>
+        <w:jc w:val="both"/>
+        <w:rPr>
+          <w:rFonts w:ascii="Arial" w:hAnsi="Arial" w:cs="Arial"/>
+        </w:rPr>
+      </w:pPr>
+      <w:r>
+        <w:rPr>
+          <w:rFonts w:ascii="Arial" w:hAnsi="Arial" w:cs="Arial"/>
+        </w:rPr>
+        <w:t>Preencher nome de serviço já existente;</w:t>
+      </w:r>
+    </w:p>
+    <w:p>
+      <w:pPr>
+        <w:numPr>
+          <w:ilvl w:val="1"/>
+          <w:numId w:val="19"/>
+        </w:numPr>
+        <w:jc w:val="both"/>
+        <w:rPr>
+          <w:rFonts w:ascii="Arial" w:hAnsi="Arial" w:cs="Arial"/>
+        </w:rPr>
+      </w:pPr>
+      <w:r>
+        <w:rPr>
+          <w:rFonts w:ascii="Arial" w:hAnsi="Arial" w:cs="Arial"/>
+        </w:rPr>
+        <w:t>Clicar em "Salvar".</w:t>
+      </w:r>
+    </w:p>
+    <w:p>
+      <w:pPr>
+        <w:numPr>
+          <w:ilvl w:val="0"/>
+          <w:numId w:val="19"/>
+        </w:numPr>
+        <w:jc w:val="both"/>
+        <w:rPr>
+          <w:rFonts w:ascii="Arial" w:hAnsi="Arial" w:cs="Arial"/>
+        </w:rPr>
+      </w:pPr>
+      <w:r>
+        <w:rPr>
+          <w:rFonts w:ascii="Arial" w:hAnsi="Arial" w:cs="Arial"/>
+          <w:b/>
+          <w:bCs/>
+        </w:rPr>
+        <w:t>Resultado esperado:</w:t>
+      </w:r>
+      <w:r>
+        <w:rPr>
+          <w:rFonts w:ascii="Arial" w:hAnsi="Arial" w:cs="Arial"/>
+        </w:rPr>
+        <w:t xml:space="preserve"> Sistema rejeita e informa duplicidade.</w:t>
+      </w:r>
+    </w:p>
+    <w:p>
+      <w:pPr>
+        <w:numPr>
+          <w:ilvl w:val="0"/>
+          <w:numId w:val="19"/>
+        </w:numPr>
+        <w:jc w:val="both"/>
+        <w:rPr>
+          <w:rFonts w:ascii="Arial" w:hAnsi="Arial" w:cs="Arial"/>
+        </w:rPr>
+      </w:pPr>
+      <w:r>
+        <w:rPr>
+          <w:rFonts w:ascii="Arial" w:hAnsi="Arial" w:cs="Arial"/>
+          <w:b/>
+          <w:bCs/>
+        </w:rPr>
+        <w:t>Responsável pela Execução:</w:t>
+      </w:r>
+    </w:p>
+    <w:p>
+      <w:pPr>
+        <w:numPr>
+          <w:ilvl w:val="0"/>
+          <w:numId w:val="19"/>
+        </w:numPr>
+        <w:jc w:val="both"/>
+        <w:rPr>
+          <w:rFonts w:ascii="Arial" w:hAnsi="Arial" w:cs="Arial"/>
+        </w:rPr>
+      </w:pPr>
+      <w:r>
+        <w:rPr>
+          <w:rFonts w:ascii="Arial" w:hAnsi="Arial" w:cs="Arial"/>
+          <w:b/>
+          <w:bCs/>
+        </w:rPr>
+        <w:t>Resultado Obtido:</w:t>
+      </w:r>
+    </w:p>
+    <w:p>
+      <w:pPr>
+        <w:numPr>
+          <w:ilvl w:val="0"/>
+          <w:numId w:val="19"/>
+        </w:numPr>
+        <w:jc w:val="both"/>
+        <w:rPr>
+          <w:rFonts w:ascii="Arial" w:hAnsi="Arial" w:cs="Arial"/>
+        </w:rPr>
+      </w:pPr>
+      <w:r>
+        <w:rPr>
+          <w:rFonts w:ascii="Arial" w:hAnsi="Arial" w:cs="Arial"/>
+          <w:b/>
+          <w:bCs/>
+        </w:rPr>
+        <w:t>Tempo de Execução:</w:t>
+      </w:r>
+    </w:p>
+    <w:p>
+      <w:pPr>
+        <w:numPr>
+          <w:ilvl w:val="0"/>
+          <w:numId w:val="19"/>
+        </w:numPr>
+        <w:jc w:val="both"/>
+        <w:rPr>
+          <w:rFonts w:ascii="Arial" w:hAnsi="Arial" w:cs="Arial"/>
+        </w:rPr>
+      </w:pPr>
+      <w:r>
+        <w:rPr>
+          <w:rFonts w:ascii="Arial" w:hAnsi="Arial" w:cs="Arial"/>
+          <w:b/>
+          <w:bCs/>
+        </w:rPr>
+        <w:t>Observações:</w:t>
+      </w:r>
+    </w:p>
+    <w:p>
+      <w:pPr>
+        <w:numPr>
+          <w:ilvl w:val="0"/>
+          <w:numId w:val="19"/>
+        </w:numPr>
+        <w:jc w:val="both"/>
+        <w:rPr>
+          <w:rFonts w:ascii="Arial" w:hAnsi="Arial" w:cs="Arial"/>
+        </w:rPr>
+      </w:pPr>
+      <w:r>
+        <w:rPr>
+          <w:rFonts w:ascii="Arial" w:hAnsi="Arial" w:cs="Arial"/>
+          <w:b/>
+          <w:bCs/>
+        </w:rPr>
+        <w:t>Melhorias Sugeridas:</w:t>
+      </w:r>
+    </w:p>
+    <w:p>
+      <w:pPr>
+        <w:jc w:val="both"/>
+        <w:rPr>
+          <w:rFonts w:ascii="Arial" w:hAnsi="Arial" w:cs="Arial"/>
+        </w:rPr>
+      </w:pPr>
+    </w:p>
+    <w:p>
+      <w:pPr>
+        <w:pStyle w:val="Ttulo2"/>
+        <w:rPr>
+          <w:b/>
+          <w:bCs/>
+        </w:rPr>
+      </w:pPr>
+      <w:r>
+        <w:rPr>
+          <w:b/>
+          <w:bCs/>
+        </w:rPr>
+        <w:t>CT13 – Buscar funcionário por nome</w:t>
+      </w:r>
+    </w:p>
+    <w:p>
+      <w:pPr>
+        <w:numPr>
+          <w:ilvl w:val="0"/>
+          <w:numId w:val="20"/>
+        </w:numPr>
+        <w:jc w:val="both"/>
+        <w:rPr>
+          <w:rFonts w:ascii="Arial" w:hAnsi="Arial" w:cs="Arial"/>
+        </w:rPr>
+      </w:pPr>
+      <w:r>
+        <w:rPr>
+          <w:rFonts w:ascii="Arial" w:hAnsi="Arial" w:cs="Arial"/>
+          <w:b/>
+          <w:bCs/>
+        </w:rPr>
+        <w:t>Objetivo:</w:t>
+      </w:r>
+      <w:r>
+        <w:rPr>
+          <w:rFonts w:ascii="Arial" w:hAnsi="Arial" w:cs="Arial"/>
+        </w:rPr>
+        <w:t xml:space="preserve"> Verificar se a busca por nome retorna resultados corretamente.</w:t>
+      </w:r>
+    </w:p>
+    <w:p>
+      <w:pPr>
+        <w:numPr>
+          <w:ilvl w:val="0"/>
+          <w:numId w:val="20"/>
+        </w:numPr>
+        <w:jc w:val="both"/>
+        <w:rPr>
+          <w:rFonts w:ascii="Arial" w:hAnsi="Arial" w:cs="Arial"/>
+        </w:rPr>
+      </w:pPr>
+      <w:r>
+        <w:rPr>
+          <w:rFonts w:ascii="Arial" w:hAnsi="Arial" w:cs="Arial"/>
+          <w:b/>
+          <w:bCs/>
+        </w:rPr>
+        <w:t>Pré-condições:</w:t>
+      </w:r>
+      <w:r>
+        <w:rPr>
+          <w:rFonts w:ascii="Arial" w:hAnsi="Arial" w:cs="Arial"/>
+        </w:rPr>
+        <w:t xml:space="preserve"> Funcionário cadastrado.</w:t>
+      </w:r>
+    </w:p>
+    <w:p>
+      <w:pPr>
+        <w:numPr>
+          <w:ilvl w:val="0"/>
+          <w:numId w:val="20"/>
+        </w:numPr>
+        <w:jc w:val="both"/>
+        <w:rPr>
+          <w:rFonts w:ascii="Arial" w:hAnsi="Arial" w:cs="Arial"/>
+        </w:rPr>
+      </w:pPr>
+      <w:r>
+        <w:rPr>
+          <w:rFonts w:ascii="Arial" w:hAnsi="Arial" w:cs="Arial"/>
+          <w:b/>
+          <w:bCs/>
+        </w:rPr>
+        <w:t>Entradas:</w:t>
+      </w:r>
+      <w:r>
+        <w:rPr>
+          <w:rFonts w:ascii="Arial" w:hAnsi="Arial" w:cs="Arial"/>
+        </w:rPr>
+        <w:t xml:space="preserve"> Nome existente.</w:t>
+      </w:r>
+    </w:p>
+    <w:p>
+      <w:pPr>
+        <w:numPr>
+          <w:ilvl w:val="0"/>
+          <w:numId w:val="20"/>
+        </w:numPr>
+        <w:jc w:val="both"/>
+        <w:rPr>
+          <w:rFonts w:ascii="Arial" w:hAnsi="Arial" w:cs="Arial"/>
+        </w:rPr>
+      </w:pPr>
+      <w:r>
+        <w:rPr>
+          <w:rFonts w:ascii="Arial" w:hAnsi="Arial" w:cs="Arial"/>
+          <w:b/>
+          <w:bCs/>
+        </w:rPr>
+        <w:t>Passos:</w:t>
+      </w:r>
+    </w:p>
+    <w:p>
+      <w:pPr>
+        <w:numPr>
+          <w:ilvl w:val="1"/>
+          <w:numId w:val="20"/>
+        </w:numPr>
+        <w:jc w:val="both"/>
+        <w:rPr>
+          <w:rFonts w:ascii="Arial" w:hAnsi="Arial" w:cs="Arial"/>
+        </w:rPr>
+      </w:pPr>
+      <w:r>
+        <w:rPr>
+          <w:rFonts w:ascii="Arial" w:hAnsi="Arial" w:cs="Arial"/>
+        </w:rPr>
+        <w:t>Acessar busca de funcionários;</w:t>
+      </w:r>
+    </w:p>
+    <w:p>
+      <w:pPr>
+        <w:numPr>
+          <w:ilvl w:val="1"/>
+          <w:numId w:val="20"/>
+        </w:numPr>
+        <w:jc w:val="both"/>
+        <w:rPr>
+          <w:rFonts w:ascii="Arial" w:hAnsi="Arial" w:cs="Arial"/>
+        </w:rPr>
+      </w:pPr>
+      <w:r>
+        <w:rPr>
+          <w:rFonts w:ascii="Arial" w:hAnsi="Arial" w:cs="Arial"/>
+        </w:rPr>
+        <w:t>Inserir nome existente;</w:t>
+      </w:r>
+    </w:p>
+    <w:p>
+      <w:pPr>
+        <w:numPr>
+          <w:ilvl w:val="0"/>
+          <w:numId w:val="20"/>
+        </w:numPr>
+        <w:jc w:val="both"/>
+        <w:rPr>
+          <w:rFonts w:ascii="Arial" w:hAnsi="Arial" w:cs="Arial"/>
+        </w:rPr>
+      </w:pPr>
+      <w:r>
+        <w:rPr>
+          <w:rFonts w:ascii="Arial" w:hAnsi="Arial" w:cs="Arial"/>
+          <w:b/>
+          <w:bCs/>
+        </w:rPr>
+        <w:t>Resultado esperado:</w:t>
+      </w:r>
+      <w:r>
+        <w:rPr>
+          <w:rFonts w:ascii="Arial" w:hAnsi="Arial" w:cs="Arial"/>
+        </w:rPr>
+        <w:t xml:space="preserve"> Funcionário é listado corretamente.</w:t>
+      </w:r>
+    </w:p>
+    <w:p>
+      <w:pPr>
+        <w:numPr>
+          <w:ilvl w:val="0"/>
+          <w:numId w:val="20"/>
+        </w:numPr>
+        <w:jc w:val="both"/>
+        <w:rPr>
+          <w:rFonts w:ascii="Arial" w:hAnsi="Arial" w:cs="Arial"/>
+        </w:rPr>
+      </w:pPr>
+      <w:r>
+        <w:rPr>
+          <w:rFonts w:ascii="Arial" w:hAnsi="Arial" w:cs="Arial"/>
+          <w:b/>
+          <w:bCs/>
+        </w:rPr>
+        <w:t>Responsável pela Execução:</w:t>
+      </w:r>
+    </w:p>
+    <w:p>
+      <w:pPr>
+        <w:numPr>
+          <w:ilvl w:val="0"/>
+          <w:numId w:val="20"/>
+        </w:numPr>
+        <w:jc w:val="both"/>
+        <w:rPr>
+          <w:rFonts w:ascii="Arial" w:hAnsi="Arial" w:cs="Arial"/>
+        </w:rPr>
+      </w:pPr>
+      <w:r>
+        <w:rPr>
+          <w:rFonts w:ascii="Arial" w:hAnsi="Arial" w:cs="Arial"/>
+          <w:b/>
+          <w:bCs/>
+        </w:rPr>
+        <w:t>Resultado Obtido:</w:t>
+      </w:r>
+    </w:p>
+    <w:p>
+      <w:pPr>
+        <w:numPr>
+          <w:ilvl w:val="0"/>
+          <w:numId w:val="20"/>
+        </w:numPr>
+        <w:jc w:val="both"/>
+        <w:rPr>
+          <w:rFonts w:ascii="Arial" w:hAnsi="Arial" w:cs="Arial"/>
+        </w:rPr>
+      </w:pPr>
+      <w:r>
+        <w:rPr>
+          <w:rFonts w:ascii="Arial" w:hAnsi="Arial" w:cs="Arial"/>
+          <w:b/>
+          <w:bCs/>
+        </w:rPr>
+        <w:t>Tempo de Execução:</w:t>
+      </w:r>
+    </w:p>
+    <w:p>
+      <w:pPr>
+        <w:numPr>
+          <w:ilvl w:val="0"/>
+          <w:numId w:val="20"/>
+        </w:numPr>
+        <w:jc w:val="both"/>
+        <w:rPr>
+          <w:rFonts w:ascii="Arial" w:hAnsi="Arial" w:cs="Arial"/>
+        </w:rPr>
+      </w:pPr>
+      <w:r>
+        <w:rPr>
+          <w:rFonts w:ascii="Arial" w:hAnsi="Arial" w:cs="Arial"/>
+          <w:b/>
+          <w:bCs/>
+        </w:rPr>
+        <w:t>Observações:</w:t>
+      </w:r>
+    </w:p>
+    <w:p>
+      <w:pPr>
+        <w:numPr>
+          <w:ilvl w:val="0"/>
+          <w:numId w:val="20"/>
+        </w:numPr>
+        <w:jc w:val="both"/>
+        <w:rPr>
+          <w:rFonts w:ascii="Arial" w:hAnsi="Arial" w:cs="Arial"/>
+        </w:rPr>
+      </w:pPr>
+      <w:r>
+        <w:rPr>
+          <w:rFonts w:ascii="Arial" w:hAnsi="Arial" w:cs="Arial"/>
+          <w:b/>
+          <w:bCs/>
+        </w:rPr>
+        <w:t>Melhorias Sugeridas:</w:t>
+      </w:r>
+    </w:p>
+    <w:p>
+      <w:pPr>
+        <w:jc w:val="both"/>
+        <w:rPr>
+          <w:rFonts w:ascii="Arial" w:hAnsi="Arial" w:cs="Arial"/>
+        </w:rPr>
+      </w:pPr>
+    </w:p>
+    <w:p>
+      <w:pPr>
+        <w:pStyle w:val="Ttulo2"/>
+        <w:rPr>
+          <w:b/>
+          <w:bCs/>
+        </w:rPr>
+      </w:pPr>
+      <w:r>
+        <w:rPr>
+          <w:b/>
+          <w:bCs/>
+        </w:rPr>
+        <w:t>CT14 – Buscar funcionário por ID</w:t>
+      </w:r>
+    </w:p>
+    <w:p>
+      <w:pPr>
+        <w:numPr>
+          <w:ilvl w:val="0"/>
+          <w:numId w:val="21"/>
+        </w:numPr>
+        <w:jc w:val="both"/>
+        <w:rPr>
+          <w:rFonts w:ascii="Arial" w:hAnsi="Arial" w:cs="Arial"/>
+        </w:rPr>
+      </w:pPr>
+      <w:r>
+        <w:rPr>
+          <w:rFonts w:ascii="Arial" w:hAnsi="Arial" w:cs="Arial"/>
+          <w:b/>
+          <w:bCs/>
+        </w:rPr>
+        <w:t>Objetivo:</w:t>
+      </w:r>
+      <w:r>
+        <w:rPr>
+          <w:rFonts w:ascii="Arial" w:hAnsi="Arial" w:cs="Arial"/>
+        </w:rPr>
+        <w:t xml:space="preserve"> Verificar se a busca por ID retorna o funcionário correto ou exibe erro.</w:t>
+      </w:r>
+    </w:p>
+    <w:p>
+      <w:pPr>
+        <w:numPr>
+          <w:ilvl w:val="0"/>
+          <w:numId w:val="21"/>
+        </w:numPr>
+        <w:jc w:val="both"/>
+        <w:rPr>
+          <w:rFonts w:ascii="Arial" w:hAnsi="Arial" w:cs="Arial"/>
+        </w:rPr>
+      </w:pPr>
+      <w:r>
+        <w:rPr>
+          <w:rFonts w:ascii="Arial" w:hAnsi="Arial" w:cs="Arial"/>
+          <w:b/>
+          <w:bCs/>
+        </w:rPr>
+        <w:t>Pré-condições:</w:t>
+      </w:r>
+      <w:r>
+        <w:rPr>
+          <w:rFonts w:ascii="Arial" w:hAnsi="Arial" w:cs="Arial"/>
+        </w:rPr>
+        <w:t xml:space="preserve"> Funcionário cadastrado.</w:t>
+      </w:r>
+    </w:p>
+    <w:p>
+      <w:pPr>
+        <w:numPr>
+          <w:ilvl w:val="0"/>
+          <w:numId w:val="21"/>
+        </w:numPr>
+        <w:jc w:val="both"/>
+        <w:rPr>
+          <w:rFonts w:ascii="Arial" w:hAnsi="Arial" w:cs="Arial"/>
+        </w:rPr>
+      </w:pPr>
+      <w:r>
+        <w:rPr>
+          <w:rFonts w:ascii="Arial" w:hAnsi="Arial" w:cs="Arial"/>
+          <w:b/>
+          <w:bCs/>
+        </w:rPr>
+        <w:t>Entradas:</w:t>
+      </w:r>
+      <w:r>
+        <w:rPr>
+          <w:rFonts w:ascii="Arial" w:hAnsi="Arial" w:cs="Arial"/>
+        </w:rPr>
+        <w:t xml:space="preserve"> ID válido ou inválido.</w:t>
+      </w:r>
+    </w:p>
+    <w:p>
+      <w:pPr>
+        <w:numPr>
+          <w:ilvl w:val="0"/>
+          <w:numId w:val="21"/>
+        </w:numPr>
+        <w:jc w:val="both"/>
+        <w:rPr>
+          <w:rFonts w:ascii="Arial" w:hAnsi="Arial" w:cs="Arial"/>
+        </w:rPr>
+      </w:pPr>
+      <w:r>
+        <w:rPr>
+          <w:rFonts w:ascii="Arial" w:hAnsi="Arial" w:cs="Arial"/>
+          <w:b/>
+          <w:bCs/>
+        </w:rPr>
+        <w:lastRenderedPageBreak/>
+        <w:t>Passos:</w:t>
+      </w:r>
+    </w:p>
+    <w:p>
+      <w:pPr>
+        <w:numPr>
+          <w:ilvl w:val="1"/>
+          <w:numId w:val="21"/>
+        </w:numPr>
+        <w:jc w:val="both"/>
+        <w:rPr>
+          <w:rFonts w:ascii="Arial" w:hAnsi="Arial" w:cs="Arial"/>
+        </w:rPr>
+      </w:pPr>
+      <w:r>
+        <w:rPr>
+          <w:rFonts w:ascii="Arial" w:hAnsi="Arial" w:cs="Arial"/>
+        </w:rPr>
+        <w:t>Acessar busca de funcionários;</w:t>
+      </w:r>
+    </w:p>
+    <w:p>
+      <w:pPr>
+        <w:numPr>
+          <w:ilvl w:val="1"/>
+          <w:numId w:val="21"/>
+        </w:numPr>
+        <w:jc w:val="both"/>
+        <w:rPr>
+          <w:rFonts w:ascii="Arial" w:hAnsi="Arial" w:cs="Arial"/>
+        </w:rPr>
+      </w:pPr>
+      <w:r>
+        <w:rPr>
+          <w:rFonts w:ascii="Arial" w:hAnsi="Arial" w:cs="Arial"/>
+        </w:rPr>
+        <w:t>Inserir ID;</w:t>
+      </w:r>
+    </w:p>
+    <w:p>
+      <w:pPr>
+        <w:numPr>
+          <w:ilvl w:val="0"/>
+          <w:numId w:val="21"/>
+        </w:numPr>
+        <w:jc w:val="both"/>
+        <w:rPr>
+          <w:rFonts w:ascii="Arial" w:hAnsi="Arial" w:cs="Arial"/>
+        </w:rPr>
+      </w:pPr>
+      <w:r>
+        <w:rPr>
+          <w:rFonts w:ascii="Arial" w:hAnsi="Arial" w:cs="Arial"/>
+          <w:b/>
+          <w:bCs/>
+        </w:rPr>
+        <w:t>Resultado esperado:</w:t>
+      </w:r>
+      <w:r>
+        <w:rPr>
+          <w:rFonts w:ascii="Arial" w:hAnsi="Arial" w:cs="Arial"/>
+        </w:rPr>
+        <w:t xml:space="preserve"> Funcionário listado ou mensagem "não encontrado".</w:t>
+      </w:r>
+    </w:p>
+    <w:p>
+      <w:pPr>
+        <w:numPr>
+          <w:ilvl w:val="0"/>
+          <w:numId w:val="21"/>
+        </w:numPr>
+        <w:jc w:val="both"/>
+        <w:rPr>
+          <w:rFonts w:ascii="Arial" w:hAnsi="Arial" w:cs="Arial"/>
+        </w:rPr>
+      </w:pPr>
+      <w:r>
+        <w:rPr>
+          <w:rFonts w:ascii="Arial" w:hAnsi="Arial" w:cs="Arial"/>
+          <w:b/>
+          <w:bCs/>
+        </w:rPr>
+        <w:t>Responsável pela Execução:</w:t>
+      </w:r>
+    </w:p>
+    <w:p>
+      <w:pPr>
+        <w:numPr>
+          <w:ilvl w:val="0"/>
+          <w:numId w:val="21"/>
+        </w:numPr>
+        <w:jc w:val="both"/>
+        <w:rPr>
+          <w:rFonts w:ascii="Arial" w:hAnsi="Arial" w:cs="Arial"/>
+        </w:rPr>
+      </w:pPr>
+      <w:r>
+        <w:rPr>
+          <w:rFonts w:ascii="Arial" w:hAnsi="Arial" w:cs="Arial"/>
+          <w:b/>
+          <w:bCs/>
+        </w:rPr>
+        <w:t>Resultado Obtido:</w:t>
+      </w:r>
+    </w:p>
+    <w:p>
+      <w:pPr>
+        <w:numPr>
+          <w:ilvl w:val="0"/>
+          <w:numId w:val="21"/>
+        </w:numPr>
+        <w:jc w:val="both"/>
+        <w:rPr>
+          <w:rFonts w:ascii="Arial" w:hAnsi="Arial" w:cs="Arial"/>
+        </w:rPr>
+      </w:pPr>
+      <w:r>
+        <w:rPr>
+          <w:rFonts w:ascii="Arial" w:hAnsi="Arial" w:cs="Arial"/>
+          <w:b/>
+          <w:bCs/>
+        </w:rPr>
+        <w:t>Tempo de Execução:</w:t>
+      </w:r>
+    </w:p>
+    <w:p>
+      <w:pPr>
+        <w:numPr>
+          <w:ilvl w:val="0"/>
+          <w:numId w:val="21"/>
+        </w:numPr>
+        <w:jc w:val="both"/>
+        <w:rPr>
+          <w:rFonts w:ascii="Arial" w:hAnsi="Arial" w:cs="Arial"/>
+        </w:rPr>
+      </w:pPr>
+      <w:r>
+        <w:rPr>
+          <w:rFonts w:ascii="Arial" w:hAnsi="Arial" w:cs="Arial"/>
+          <w:b/>
+          <w:bCs/>
+        </w:rPr>
+        <w:t>Observações:</w:t>
+      </w:r>
+    </w:p>
+    <w:p>
+      <w:pPr>
+        <w:numPr>
+          <w:ilvl w:val="0"/>
+          <w:numId w:val="21"/>
+        </w:numPr>
+        <w:jc w:val="both"/>
+        <w:rPr>
+          <w:rFonts w:ascii="Arial" w:hAnsi="Arial" w:cs="Arial"/>
+        </w:rPr>
+      </w:pPr>
+      <w:r>
+        <w:rPr>
+          <w:rFonts w:ascii="Arial" w:hAnsi="Arial" w:cs="Arial"/>
+          <w:b/>
+          <w:bCs/>
+        </w:rPr>
+        <w:t>Melhorias Sugeridas:</w:t>
+      </w:r>
+    </w:p>
+    <w:p>
+      <w:pPr>
+        <w:jc w:val="both"/>
+        <w:rPr>
+          <w:rFonts w:ascii="Arial" w:hAnsi="Arial" w:cs="Arial"/>
+        </w:rPr>
+      </w:pPr>
+    </w:p>
+    <w:p>
+      <w:pPr>
+        <w:pStyle w:val="Ttulo2"/>
+        <w:rPr>
+          <w:b/>
+          <w:bCs/>
+        </w:rPr>
+      </w:pPr>
+      <w:r>
+        <w:rPr>
+          <w:b/>
+          <w:bCs/>
+        </w:rPr>
+        <w:t>CT15 – Verificar tempo de carregamento &lt; 2s</w:t>
+      </w:r>
+    </w:p>
+    <w:p>
+      <w:pPr>
+        <w:numPr>
+          <w:ilvl w:val="0"/>
+          <w:numId w:val="22"/>
+        </w:numPr>
+        <w:jc w:val="both"/>
+        <w:rPr>
+          <w:rFonts w:ascii="Arial" w:hAnsi="Arial" w:cs="Arial"/>
+        </w:rPr>
+      </w:pPr>
+      <w:r>
+        <w:rPr>
+          <w:rFonts w:ascii="Arial" w:hAnsi="Arial" w:cs="Arial"/>
+          <w:b/>
+          <w:bCs/>
+        </w:rPr>
+        <w:t>Objetivo:</w:t>
+      </w:r>
+      <w:r>
+        <w:rPr>
+          <w:rFonts w:ascii="Arial" w:hAnsi="Arial" w:cs="Arial"/>
+        </w:rPr>
+        <w:t xml:space="preserve"> Validar o desempenho de carregamento das principais telas.</w:t>
+      </w:r>
+    </w:p>
+    <w:p>
+      <w:pPr>
+        <w:numPr>
+          <w:ilvl w:val="0"/>
+          <w:numId w:val="22"/>
+        </w:numPr>
+        <w:jc w:val="both"/>
+        <w:rPr>
+          <w:rFonts w:ascii="Arial" w:hAnsi="Arial" w:cs="Arial"/>
+        </w:rPr>
+      </w:pPr>
+      <w:r>
+        <w:rPr>
+          <w:rFonts w:ascii="Arial" w:hAnsi="Arial" w:cs="Arial"/>
+          <w:b/>
+          <w:bCs/>
+        </w:rPr>
+        <w:t>Pré-condições:</w:t>
+      </w:r>
+      <w:r>
+        <w:rPr>
+          <w:rFonts w:ascii="Arial" w:hAnsi="Arial" w:cs="Arial"/>
+        </w:rPr>
+        <w:t xml:space="preserve"> Sistema em funcionamento.</w:t>
+      </w:r>
+    </w:p>
+    <w:p>
+      <w:pPr>
+        <w:numPr>
+          <w:ilvl w:val="0"/>
+          <w:numId w:val="22"/>
+        </w:numPr>
+        <w:jc w:val="both"/>
+        <w:rPr>
+          <w:rFonts w:ascii="Arial" w:hAnsi="Arial" w:cs="Arial"/>
+        </w:rPr>
+      </w:pPr>
+      <w:r>
+        <w:rPr>
+          <w:rFonts w:ascii="Arial" w:hAnsi="Arial" w:cs="Arial"/>
+          <w:b/>
+          <w:bCs/>
+        </w:rPr>
+        <w:t>Entradas:</w:t>
+      </w:r>
+      <w:r>
+        <w:rPr>
+          <w:rFonts w:ascii="Arial" w:hAnsi="Arial" w:cs="Arial"/>
+        </w:rPr>
+        <w:t xml:space="preserve"> Nenhuma.</w:t>
+      </w:r>
+    </w:p>
+    <w:p>
+      <w:pPr>
+        <w:numPr>
+          <w:ilvl w:val="0"/>
+          <w:numId w:val="22"/>
+        </w:numPr>
+        <w:jc w:val="both"/>
+        <w:rPr>
+          <w:rFonts w:ascii="Arial" w:hAnsi="Arial" w:cs="Arial"/>
+        </w:rPr>
+      </w:pPr>
+      <w:r>
+        <w:rPr>
+          <w:rFonts w:ascii="Arial" w:hAnsi="Arial" w:cs="Arial"/>
+          <w:b/>
+          <w:bCs/>
+        </w:rPr>
+        <w:t>Passos:</w:t>
+      </w:r>
+    </w:p>
+    <w:p>
+      <w:pPr>
+        <w:numPr>
+          <w:ilvl w:val="1"/>
+          <w:numId w:val="22"/>
+        </w:numPr>
+        <w:jc w:val="both"/>
+        <w:rPr>
+          <w:rFonts w:ascii="Arial" w:hAnsi="Arial" w:cs="Arial"/>
+        </w:rPr>
+      </w:pPr>
+      <w:r>
+        <w:rPr>
+          <w:rFonts w:ascii="Arial" w:hAnsi="Arial" w:cs="Arial"/>
+        </w:rPr>
+        <w:t>Acessar tela inicial;</w:t>
+      </w:r>
+    </w:p>
+    <w:p>
+      <w:pPr>
+        <w:numPr>
+          <w:ilvl w:val="1"/>
+          <w:numId w:val="22"/>
+        </w:numPr>
+        <w:jc w:val="both"/>
+        <w:rPr>
+          <w:rFonts w:ascii="Arial" w:hAnsi="Arial" w:cs="Arial"/>
+        </w:rPr>
+      </w:pPr>
+      <w:r>
+        <w:rPr>
+          <w:rFonts w:ascii="Arial" w:hAnsi="Arial" w:cs="Arial"/>
+        </w:rPr>
+        <w:t>Acessar tela de login;</w:t>
+      </w:r>
+    </w:p>
+    <w:p>
+      <w:pPr>
+        <w:numPr>
+          <w:ilvl w:val="1"/>
+          <w:numId w:val="22"/>
+        </w:numPr>
+        <w:jc w:val="both"/>
+        <w:rPr>
+          <w:rFonts w:ascii="Arial" w:hAnsi="Arial" w:cs="Arial"/>
+        </w:rPr>
+      </w:pPr>
+      <w:r>
+        <w:rPr>
+          <w:rFonts w:ascii="Arial" w:hAnsi="Arial" w:cs="Arial"/>
+        </w:rPr>
+        <w:t>Acessar tela de relatórios;</w:t>
+      </w:r>
+    </w:p>
+    <w:p>
+      <w:pPr>
+        <w:numPr>
+          <w:ilvl w:val="0"/>
+          <w:numId w:val="22"/>
+        </w:numPr>
+        <w:jc w:val="both"/>
+        <w:rPr>
+          <w:rFonts w:ascii="Arial" w:hAnsi="Arial" w:cs="Arial"/>
+        </w:rPr>
+      </w:pPr>
+      <w:r>
+        <w:rPr>
+          <w:rFonts w:ascii="Arial" w:hAnsi="Arial" w:cs="Arial"/>
+          <w:b/>
+          <w:bCs/>
+        </w:rPr>
+        <w:t>Resultado esperado:</w:t>
+      </w:r>
+      <w:r>
+        <w:rPr>
+          <w:rFonts w:ascii="Arial" w:hAnsi="Arial" w:cs="Arial"/>
+        </w:rPr>
+        <w:t xml:space="preserve"> Carregamento inferior a 2 segundos em todas as telas.</w:t>
+      </w:r>
+    </w:p>
+    <w:p>
+      <w:pPr>
+        <w:numPr>
+          <w:ilvl w:val="0"/>
+          <w:numId w:val="22"/>
+        </w:numPr>
+        <w:jc w:val="both"/>
+        <w:rPr>
+          <w:rFonts w:ascii="Arial" w:hAnsi="Arial" w:cs="Arial"/>
+        </w:rPr>
+      </w:pPr>
+      <w:r>
+        <w:rPr>
+          <w:rFonts w:ascii="Arial" w:hAnsi="Arial" w:cs="Arial"/>
+          <w:b/>
+          <w:bCs/>
+        </w:rPr>
+        <w:t>Responsável pela Execução:</w:t>
+      </w:r>
+    </w:p>
+    <w:p>
+      <w:pPr>
+        <w:numPr>
+          <w:ilvl w:val="0"/>
+          <w:numId w:val="22"/>
+        </w:numPr>
+        <w:jc w:val="both"/>
+        <w:rPr>
+          <w:rFonts w:ascii="Arial" w:hAnsi="Arial" w:cs="Arial"/>
+        </w:rPr>
+      </w:pPr>
+      <w:r>
+        <w:rPr>
+          <w:rFonts w:ascii="Arial" w:hAnsi="Arial" w:cs="Arial"/>
+          <w:b/>
+          <w:bCs/>
+        </w:rPr>
+        <w:t>Resultado Obtido:</w:t>
+      </w:r>
+    </w:p>
+    <w:p>
+      <w:pPr>
+        <w:numPr>
+          <w:ilvl w:val="0"/>
+          <w:numId w:val="22"/>
+        </w:numPr>
+        <w:jc w:val="both"/>
+        <w:rPr>
+          <w:rFonts w:ascii="Arial" w:hAnsi="Arial" w:cs="Arial"/>
+        </w:rPr>
+      </w:pPr>
+      <w:r>
+        <w:rPr>
+          <w:rFonts w:ascii="Arial" w:hAnsi="Arial" w:cs="Arial"/>
+          <w:b/>
+          <w:bCs/>
+        </w:rPr>
+        <w:t>Tempo de Execução:</w:t>
+      </w:r>
+    </w:p>
+    <w:p>
+      <w:pPr>
+        <w:numPr>
+          <w:ilvl w:val="0"/>
+          <w:numId w:val="22"/>
+        </w:numPr>
+        <w:jc w:val="both"/>
+        <w:rPr>
+          <w:rFonts w:ascii="Arial" w:hAnsi="Arial" w:cs="Arial"/>
+        </w:rPr>
+      </w:pPr>
+      <w:r>
+        <w:rPr>
+          <w:rFonts w:ascii="Arial" w:hAnsi="Arial" w:cs="Arial"/>
+          <w:b/>
+          <w:bCs/>
+        </w:rPr>
+        <w:t>Observações:</w:t>
+      </w:r>
+    </w:p>
+    <w:p>
+      <w:pPr>
+        <w:numPr>
+          <w:ilvl w:val="0"/>
+          <w:numId w:val="22"/>
+        </w:numPr>
+        <w:jc w:val="both"/>
+        <w:rPr>
+          <w:rFonts w:ascii="Arial" w:hAnsi="Arial" w:cs="Arial"/>
+        </w:rPr>
+      </w:pPr>
+      <w:r>
+        <w:rPr>
+          <w:rFonts w:ascii="Arial" w:hAnsi="Arial" w:cs="Arial"/>
+          <w:b/>
+          <w:bCs/>
+        </w:rPr>
+        <w:t>Melhorias Sugeridas:</w:t>
+      </w:r>
+    </w:p>
+    <w:p>
+      <w:pPr>
+        <w:jc w:val="both"/>
+        <w:rPr>
+          <w:rFonts w:ascii="Arial" w:hAnsi="Arial" w:cs="Arial"/>
+        </w:rPr>
+      </w:pPr>
+    </w:p>
+    <w:p>
+      <w:pPr>
+        <w:pStyle w:val="Ttulo2"/>
+        <w:rPr>
+          <w:b/>
+          <w:bCs/>
+        </w:rPr>
+      </w:pPr>
+      <w:r>
+        <w:rPr>
+          <w:b/>
+          <w:bCs/>
+        </w:rPr>
+        <w:t>CT16 – Validar sincronização de dados offline</w:t>
+      </w:r>
+    </w:p>
+    <w:p>
+      <w:pPr>
+        <w:numPr>
+          <w:ilvl w:val="0"/>
+          <w:numId w:val="23"/>
+        </w:numPr>
+        <w:jc w:val="both"/>
+        <w:rPr>
+          <w:rFonts w:ascii="Arial" w:hAnsi="Arial" w:cs="Arial"/>
+        </w:rPr>
+      </w:pPr>
+      <w:r>
+        <w:rPr>
+          <w:rFonts w:ascii="Arial" w:hAnsi="Arial" w:cs="Arial"/>
+          <w:b/>
+          <w:bCs/>
+        </w:rPr>
+        <w:t>Objetivo:</w:t>
+      </w:r>
+      <w:r>
+        <w:rPr>
+          <w:rFonts w:ascii="Arial" w:hAnsi="Arial" w:cs="Arial"/>
+        </w:rPr>
+        <w:t xml:space="preserve"> Verificar se o sistema sincroniza dados ao reconectar.</w:t>
+      </w:r>
+    </w:p>
+    <w:p>
+      <w:pPr>
+        <w:numPr>
+          <w:ilvl w:val="0"/>
+          <w:numId w:val="23"/>
+        </w:numPr>
+        <w:jc w:val="both"/>
+        <w:rPr>
+          <w:rFonts w:ascii="Arial" w:hAnsi="Arial" w:cs="Arial"/>
+        </w:rPr>
+      </w:pPr>
+      <w:r>
+        <w:rPr>
+          <w:rFonts w:ascii="Arial" w:hAnsi="Arial" w:cs="Arial"/>
+          <w:b/>
+          <w:bCs/>
+        </w:rPr>
+        <w:t>Pré-condições:</w:t>
+      </w:r>
+      <w:r>
+        <w:rPr>
+          <w:rFonts w:ascii="Arial" w:hAnsi="Arial" w:cs="Arial"/>
+        </w:rPr>
+        <w:t xml:space="preserve"> Conexão com internet desativada.</w:t>
+      </w:r>
+    </w:p>
+    <w:p>
+      <w:pPr>
+        <w:numPr>
+          <w:ilvl w:val="0"/>
+          <w:numId w:val="23"/>
+        </w:numPr>
+        <w:jc w:val="both"/>
+        <w:rPr>
+          <w:rFonts w:ascii="Arial" w:hAnsi="Arial" w:cs="Arial"/>
+        </w:rPr>
+      </w:pPr>
+      <w:r>
+        <w:rPr>
+          <w:rFonts w:ascii="Arial" w:hAnsi="Arial" w:cs="Arial"/>
+          <w:b/>
+          <w:bCs/>
+        </w:rPr>
+        <w:lastRenderedPageBreak/>
+        <w:t>Entradas:</w:t>
+      </w:r>
+      <w:r>
+        <w:rPr>
+          <w:rFonts w:ascii="Arial" w:hAnsi="Arial" w:cs="Arial"/>
+        </w:rPr>
+        <w:t xml:space="preserve"> Serviço registrado offline.</w:t>
+      </w:r>
+    </w:p>
+    <w:p>
+      <w:pPr>
+        <w:numPr>
+          <w:ilvl w:val="0"/>
+          <w:numId w:val="23"/>
+        </w:numPr>
+        <w:jc w:val="both"/>
+        <w:rPr>
+          <w:rFonts w:ascii="Arial" w:hAnsi="Arial" w:cs="Arial"/>
+        </w:rPr>
+      </w:pPr>
+      <w:r>
+        <w:rPr>
+          <w:rFonts w:ascii="Arial" w:hAnsi="Arial" w:cs="Arial"/>
+          <w:b/>
+          <w:bCs/>
+        </w:rPr>
+        <w:t>Passos:</w:t>
+      </w:r>
+    </w:p>
+    <w:p>
+      <w:pPr>
+        <w:numPr>
+          <w:ilvl w:val="1"/>
+          <w:numId w:val="23"/>
+        </w:numPr>
+        <w:jc w:val="both"/>
+        <w:rPr>
+          <w:rFonts w:ascii="Arial" w:hAnsi="Arial" w:cs="Arial"/>
+        </w:rPr>
+      </w:pPr>
+      <w:r>
+        <w:rPr>
+          <w:rFonts w:ascii="Arial" w:hAnsi="Arial" w:cs="Arial"/>
+        </w:rPr>
+        <w:t>Desativar a internet;</w:t>
+      </w:r>
+    </w:p>
+    <w:p>
+      <w:pPr>
+        <w:numPr>
+          <w:ilvl w:val="1"/>
+          <w:numId w:val="23"/>
+        </w:numPr>
+        <w:jc w:val="both"/>
+        <w:rPr>
+          <w:rFonts w:ascii="Arial" w:hAnsi="Arial" w:cs="Arial"/>
+        </w:rPr>
+      </w:pPr>
+      <w:r>
+        <w:rPr>
+          <w:rFonts w:ascii="Arial" w:hAnsi="Arial" w:cs="Arial"/>
+        </w:rPr>
+        <w:t>Registrar serviço;</w:t>
+      </w:r>
+    </w:p>
+    <w:p>
+      <w:pPr>
+        <w:numPr>
+          <w:ilvl w:val="1"/>
+          <w:numId w:val="23"/>
+        </w:numPr>
+        <w:jc w:val="both"/>
+        <w:rPr>
+          <w:rFonts w:ascii="Arial" w:hAnsi="Arial" w:cs="Arial"/>
+        </w:rPr>
+      </w:pPr>
+      <w:r>
+        <w:rPr>
+          <w:rFonts w:ascii="Arial" w:hAnsi="Arial" w:cs="Arial"/>
+        </w:rPr>
+        <w:t>Reativar internet;</w:t>
+      </w:r>
+    </w:p>
+    <w:p>
+      <w:pPr>
+        <w:numPr>
+          <w:ilvl w:val="0"/>
+          <w:numId w:val="23"/>
+        </w:numPr>
+        <w:jc w:val="both"/>
+        <w:rPr>
+          <w:rFonts w:ascii="Arial" w:hAnsi="Arial" w:cs="Arial"/>
+        </w:rPr>
+      </w:pPr>
+      <w:r>
+        <w:rPr>
+          <w:rFonts w:ascii="Arial" w:hAnsi="Arial" w:cs="Arial"/>
+          <w:b/>
+          <w:bCs/>
+        </w:rPr>
+        <w:t>Resultado esperado:</w:t>
+      </w:r>
+      <w:r>
+        <w:rPr>
+          <w:rFonts w:ascii="Arial" w:hAnsi="Arial" w:cs="Arial"/>
+        </w:rPr>
+        <w:t xml:space="preserve"> Dados sincronizados automaticamente com o banco.</w:t>
+      </w:r>
+    </w:p>
+    <w:p>
+      <w:pPr>
+        <w:numPr>
+          <w:ilvl w:val="0"/>
+          <w:numId w:val="23"/>
+        </w:numPr>
+        <w:jc w:val="both"/>
+        <w:rPr>
+          <w:rFonts w:ascii="Arial" w:hAnsi="Arial" w:cs="Arial"/>
+        </w:rPr>
+      </w:pPr>
+      <w:r>
+        <w:rPr>
+          <w:rFonts w:ascii="Arial" w:hAnsi="Arial" w:cs="Arial"/>
+          <w:b/>
+          <w:bCs/>
+        </w:rPr>
+        <w:t>Responsável pela Execução:</w:t>
+      </w:r>
+    </w:p>
+    <w:p>
+      <w:pPr>
+        <w:numPr>
+          <w:ilvl w:val="0"/>
+          <w:numId w:val="23"/>
+        </w:numPr>
+        <w:jc w:val="both"/>
+        <w:rPr>
+          <w:rFonts w:ascii="Arial" w:hAnsi="Arial" w:cs="Arial"/>
+        </w:rPr>
+      </w:pPr>
+      <w:r>
+        <w:rPr>
+          <w:rFonts w:ascii="Arial" w:hAnsi="Arial" w:cs="Arial"/>
+          <w:b/>
+          <w:bCs/>
+        </w:rPr>
+        <w:t>Resultado Obtido:</w:t>
+      </w:r>
+    </w:p>
+    <w:p>
+      <w:pPr>
+        <w:numPr>
+          <w:ilvl w:val="0"/>
+          <w:numId w:val="23"/>
+        </w:numPr>
+        <w:jc w:val="both"/>
+        <w:rPr>
+          <w:rFonts w:ascii="Arial" w:hAnsi="Arial" w:cs="Arial"/>
+        </w:rPr>
+      </w:pPr>
+      <w:r>
+        <w:rPr>
+          <w:rFonts w:ascii="Arial" w:hAnsi="Arial" w:cs="Arial"/>
+          <w:b/>
+          <w:bCs/>
+        </w:rPr>
+        <w:t>Tempo de Execução:</w:t>
+      </w:r>
+    </w:p>
+    <w:p>
+      <w:pPr>
+        <w:numPr>
+          <w:ilvl w:val="0"/>
+          <w:numId w:val="23"/>
+        </w:numPr>
+        <w:jc w:val="both"/>
+        <w:rPr>
+          <w:rFonts w:ascii="Arial" w:hAnsi="Arial" w:cs="Arial"/>
+        </w:rPr>
+      </w:pPr>
+      <w:r>
+        <w:rPr>
+          <w:rFonts w:ascii="Arial" w:hAnsi="Arial" w:cs="Arial"/>
+          <w:b/>
+          <w:bCs/>
+        </w:rPr>
+        <w:t>Observações:</w:t>
+      </w:r>
+    </w:p>
+    <w:p>
+      <w:pPr>
+        <w:numPr>
+          <w:ilvl w:val="0"/>
+          <w:numId w:val="23"/>
+        </w:numPr>
+        <w:jc w:val="both"/>
+        <w:rPr>
+          <w:rFonts w:ascii="Arial" w:hAnsi="Arial" w:cs="Arial"/>
+        </w:rPr>
+      </w:pPr>
+      <w:r>
+        <w:rPr>
+          <w:rFonts w:ascii="Arial" w:hAnsi="Arial" w:cs="Arial"/>
+          <w:b/>
+          <w:bCs/>
+        </w:rPr>
+        <w:t>Melhorias Sugeridas:</w:t>
+      </w:r>
+    </w:p>
+    <w:p>
+      <w:pPr>
+        <w:jc w:val="both"/>
+        <w:rPr>
+          <w:rFonts w:ascii="Arial" w:hAnsi="Arial" w:cs="Arial"/>
+        </w:rPr>
+      </w:pPr>
+    </w:p>
+    <w:p>
+      <w:pPr>
+        <w:pStyle w:val="Ttulo2"/>
+        <w:rPr>
+          <w:b/>
+          <w:bCs/>
+        </w:rPr>
+      </w:pPr>
+      <w:r>
+        <w:rPr>
+          <w:b/>
+          <w:bCs/>
+        </w:rPr>
+        <w:t>CT17 – Verificar controle de permissões por perfil</w:t>
+      </w:r>
+    </w:p>
+    <w:p>
+      <w:pPr>
+        <w:numPr>
+          <w:ilvl w:val="0"/>
+          <w:numId w:val="24"/>
+        </w:numPr>
+        <w:jc w:val="both"/>
+        <w:rPr>
+          <w:rFonts w:ascii="Arial" w:hAnsi="Arial" w:cs="Arial"/>
+        </w:rPr>
+      </w:pPr>
+      <w:r>
+        <w:rPr>
+          <w:rFonts w:ascii="Arial" w:hAnsi="Arial" w:cs="Arial"/>
+          <w:b/>
+          <w:bCs/>
+        </w:rPr>
+        <w:t>Objetivo:</w:t>
+      </w:r>
+      <w:r>
+        <w:rPr>
+          <w:rFonts w:ascii="Arial" w:hAnsi="Arial" w:cs="Arial"/>
+        </w:rPr>
+        <w:t xml:space="preserve"> Validar que o funcionário não tenha acesso a recursos administrativos.</w:t>
+      </w:r>
+    </w:p>
+    <w:p>
+      <w:pPr>
+        <w:numPr>
+          <w:ilvl w:val="0"/>
+          <w:numId w:val="24"/>
+        </w:numPr>
+        <w:jc w:val="both"/>
+        <w:rPr>
+          <w:rFonts w:ascii="Arial" w:hAnsi="Arial" w:cs="Arial"/>
+        </w:rPr>
+      </w:pPr>
+      <w:r>
+        <w:rPr>
+          <w:rFonts w:ascii="Arial" w:hAnsi="Arial" w:cs="Arial"/>
+          <w:b/>
+          <w:bCs/>
+        </w:rPr>
+        <w:t>Pré-condições:</w:t>
+      </w:r>
+      <w:r>
+        <w:rPr>
+          <w:rFonts w:ascii="Arial" w:hAnsi="Arial" w:cs="Arial"/>
+        </w:rPr>
+        <w:t xml:space="preserve"> Conta de funcionário ativa.</w:t>
+      </w:r>
+    </w:p>
+    <w:p>
+      <w:pPr>
+        <w:numPr>
+          <w:ilvl w:val="0"/>
+          <w:numId w:val="24"/>
+        </w:numPr>
+        <w:jc w:val="both"/>
+        <w:rPr>
+          <w:rFonts w:ascii="Arial" w:hAnsi="Arial" w:cs="Arial"/>
+        </w:rPr>
+      </w:pPr>
+      <w:r>
+        <w:rPr>
+          <w:rFonts w:ascii="Arial" w:hAnsi="Arial" w:cs="Arial"/>
+          <w:b/>
+          <w:bCs/>
+        </w:rPr>
+        <w:t>Entradas:</w:t>
+      </w:r>
+      <w:r>
+        <w:rPr>
+          <w:rFonts w:ascii="Arial" w:hAnsi="Arial" w:cs="Arial"/>
+        </w:rPr>
+        <w:t xml:space="preserve"> Tentativa de acesso a funcionalidades de administrador.</w:t>
+      </w:r>
+    </w:p>
+    <w:p>
+      <w:pPr>
+        <w:numPr>
+          <w:ilvl w:val="0"/>
+          <w:numId w:val="24"/>
+        </w:numPr>
+        <w:jc w:val="both"/>
+        <w:rPr>
+          <w:rFonts w:ascii="Arial" w:hAnsi="Arial" w:cs="Arial"/>
+        </w:rPr>
+      </w:pPr>
+      <w:r>
+        <w:rPr>
+          <w:rFonts w:ascii="Arial" w:hAnsi="Arial" w:cs="Arial"/>
+          <w:b/>
+          <w:bCs/>
+        </w:rPr>
+        <w:t>Passos:</w:t>
+      </w:r>
+    </w:p>
+    <w:p>
+      <w:pPr>
+        <w:numPr>
+          <w:ilvl w:val="1"/>
+          <w:numId w:val="24"/>
+        </w:numPr>
+        <w:jc w:val="both"/>
+        <w:rPr>
+          <w:rFonts w:ascii="Arial" w:hAnsi="Arial" w:cs="Arial"/>
+        </w:rPr>
+      </w:pPr>
+      <w:proofErr w:type="spellStart"/>
+      <w:r>
+        <w:rPr>
+          <w:rFonts w:ascii="Arial" w:hAnsi="Arial" w:cs="Arial"/>
+        </w:rPr>
+        <w:t>Logar</w:t>
+      </w:r>
+      <w:proofErr w:type="spellEnd"/>
+      <w:r>
+        <w:rPr>
+          <w:rFonts w:ascii="Arial" w:hAnsi="Arial" w:cs="Arial"/>
+        </w:rPr>
+        <w:t xml:space="preserve"> como funcionário;</w:t>
+      </w:r>
+    </w:p>
+    <w:p>
+      <w:pPr>
+        <w:numPr>
+          <w:ilvl w:val="1"/>
+          <w:numId w:val="24"/>
+        </w:numPr>
+        <w:jc w:val="both"/>
+        <w:rPr>
+          <w:rFonts w:ascii="Arial" w:hAnsi="Arial" w:cs="Arial"/>
+        </w:rPr>
+      </w:pPr>
+      <w:r>
+        <w:rPr>
+          <w:rFonts w:ascii="Arial" w:hAnsi="Arial" w:cs="Arial"/>
+        </w:rPr>
+        <w:t>Tentar acessar "Relatórios";</w:t>
+      </w:r>
+    </w:p>
+    <w:p>
+      <w:pPr>
+        <w:numPr>
+          <w:ilvl w:val="0"/>
+          <w:numId w:val="24"/>
+        </w:numPr>
+        <w:jc w:val="both"/>
+        <w:rPr>
+          <w:rFonts w:ascii="Arial" w:hAnsi="Arial" w:cs="Arial"/>
+        </w:rPr>
+      </w:pPr>
+      <w:r>
+        <w:rPr>
+          <w:rFonts w:ascii="Arial" w:hAnsi="Arial" w:cs="Arial"/>
+          <w:b/>
+          <w:bCs/>
+        </w:rPr>
+        <w:t>Resultado esperado:</w:t>
+      </w:r>
+      <w:r>
+        <w:rPr>
+          <w:rFonts w:ascii="Arial" w:hAnsi="Arial" w:cs="Arial"/>
+        </w:rPr>
+        <w:t xml:space="preserve"> Acesso negado ou menus ocultos.</w:t>
+      </w:r>
+    </w:p>
+    <w:p>
+      <w:pPr>
+        <w:numPr>
+          <w:ilvl w:val="0"/>
+          <w:numId w:val="24"/>
+        </w:numPr>
+        <w:jc w:val="both"/>
+        <w:rPr>
+          <w:rFonts w:ascii="Arial" w:hAnsi="Arial" w:cs="Arial"/>
+        </w:rPr>
+      </w:pPr>
+      <w:r>
+        <w:rPr>
+          <w:rFonts w:ascii="Arial" w:hAnsi="Arial" w:cs="Arial"/>
+          <w:b/>
+          <w:bCs/>
+        </w:rPr>
+        <w:t>Responsável pela Execução:</w:t>
+      </w:r>
+    </w:p>
+    <w:p>
+      <w:pPr>
+        <w:numPr>
+          <w:ilvl w:val="0"/>
+          <w:numId w:val="24"/>
+        </w:numPr>
+        <w:jc w:val="both"/>
+        <w:rPr>
+          <w:rFonts w:ascii="Arial" w:hAnsi="Arial" w:cs="Arial"/>
+        </w:rPr>
+      </w:pPr>
+      <w:r>
+        <w:rPr>
+          <w:rFonts w:ascii="Arial" w:hAnsi="Arial" w:cs="Arial"/>
+          <w:b/>
+          <w:bCs/>
+        </w:rPr>
+        <w:t>Resultado Obtido:</w:t>
+      </w:r>
+    </w:p>
+    <w:p>
+      <w:pPr>
+        <w:numPr>
+          <w:ilvl w:val="0"/>
+          <w:numId w:val="24"/>
+        </w:numPr>
+        <w:jc w:val="both"/>
+        <w:rPr>
+          <w:rFonts w:ascii="Arial" w:hAnsi="Arial" w:cs="Arial"/>
+        </w:rPr>
+      </w:pPr>
+      <w:r>
+        <w:rPr>
+          <w:rFonts w:ascii="Arial" w:hAnsi="Arial" w:cs="Arial"/>
+          <w:b/>
+          <w:bCs/>
+        </w:rPr>
+        <w:t>Tempo de Execução:</w:t>
+      </w:r>
+    </w:p>
+    <w:p>
+      <w:pPr>
+        <w:numPr>
+          <w:ilvl w:val="0"/>
+          <w:numId w:val="24"/>
+        </w:numPr>
+        <w:jc w:val="both"/>
+        <w:rPr>
+          <w:rFonts w:ascii="Arial" w:hAnsi="Arial" w:cs="Arial"/>
+        </w:rPr>
+      </w:pPr>
+      <w:r>
+        <w:rPr>
+          <w:rFonts w:ascii="Arial" w:hAnsi="Arial" w:cs="Arial"/>
+          <w:b/>
+          <w:bCs/>
+        </w:rPr>
+        <w:t>Observações:</w:t>
+      </w:r>
+    </w:p>
+    <w:p>
+      <w:pPr>
+        <w:numPr>
+          <w:ilvl w:val="0"/>
+          <w:numId w:val="24"/>
+        </w:numPr>
+        <w:jc w:val="both"/>
+        <w:rPr>
+          <w:rFonts w:ascii="Arial" w:hAnsi="Arial" w:cs="Arial"/>
+        </w:rPr>
+      </w:pPr>
+      <w:r>
+        <w:rPr>
+          <w:rFonts w:ascii="Arial" w:hAnsi="Arial" w:cs="Arial"/>
+          <w:b/>
+          <w:bCs/>
+        </w:rPr>
+        <w:t>Melhorias Sugeridas:</w:t>
+      </w:r>
+    </w:p>
+    <w:p>
+      <w:pPr>
+        <w:jc w:val="both"/>
+        <w:rPr>
+          <w:rFonts w:ascii="Arial" w:hAnsi="Arial" w:cs="Arial"/>
+        </w:rPr>
+      </w:pPr>
+    </w:p>
+    <w:p>
+      <w:pPr>
+        <w:pStyle w:val="Ttulo2"/>
+        <w:rPr>
+          <w:b/>
+          <w:bCs/>
+        </w:rPr>
+      </w:pPr>
+      <w:r>
+        <w:rPr>
+          <w:b/>
+          <w:bCs/>
+        </w:rPr>
+        <w:lastRenderedPageBreak/>
+        <w:t>CT18 – Impedir exclusão de serviço vinculado a atendimentos</w:t>
+      </w:r>
+    </w:p>
+    <w:p>
+      <w:pPr>
+        <w:numPr>
+          <w:ilvl w:val="0"/>
+          <w:numId w:val="25"/>
+        </w:numPr>
+        <w:jc w:val="both"/>
+        <w:rPr>
+          <w:rFonts w:ascii="Arial" w:hAnsi="Arial" w:cs="Arial"/>
+        </w:rPr>
+      </w:pPr>
+      <w:r>
+        <w:rPr>
+          <w:rFonts w:ascii="Arial" w:hAnsi="Arial" w:cs="Arial"/>
+          <w:b/>
+          <w:bCs/>
+        </w:rPr>
+        <w:t>Objetivo:</w:t>
+      </w:r>
+      <w:r>
+        <w:rPr>
+          <w:rFonts w:ascii="Arial" w:hAnsi="Arial" w:cs="Arial"/>
+        </w:rPr>
+        <w:t xml:space="preserve"> Validar regra de negócio que impede exclusão de serviços usados.</w:t>
+      </w:r>
+    </w:p>
+    <w:p>
+      <w:pPr>
+        <w:numPr>
+          <w:ilvl w:val="0"/>
+          <w:numId w:val="25"/>
+        </w:numPr>
+        <w:jc w:val="both"/>
+        <w:rPr>
+          <w:rFonts w:ascii="Arial" w:hAnsi="Arial" w:cs="Arial"/>
+        </w:rPr>
+      </w:pPr>
+      <w:r>
+        <w:rPr>
+          <w:rFonts w:ascii="Arial" w:hAnsi="Arial" w:cs="Arial"/>
+          <w:b/>
+          <w:bCs/>
+        </w:rPr>
+        <w:t>Pré-condições:</w:t>
+      </w:r>
+      <w:r>
+        <w:rPr>
+          <w:rFonts w:ascii="Arial" w:hAnsi="Arial" w:cs="Arial"/>
+        </w:rPr>
+        <w:t xml:space="preserve"> Serviço já utilizado em atendimentos.</w:t>
+      </w:r>
+    </w:p>
+    <w:p>
+      <w:pPr>
+        <w:numPr>
+          <w:ilvl w:val="0"/>
+          <w:numId w:val="25"/>
+        </w:numPr>
+        <w:jc w:val="both"/>
+        <w:rPr>
+          <w:rFonts w:ascii="Arial" w:hAnsi="Arial" w:cs="Arial"/>
+        </w:rPr>
+      </w:pPr>
+      <w:r>
+        <w:rPr>
+          <w:rFonts w:ascii="Arial" w:hAnsi="Arial" w:cs="Arial"/>
+          <w:b/>
+          <w:bCs/>
+        </w:rPr>
+        <w:t>Entradas:</w:t>
+      </w:r>
+      <w:r>
+        <w:rPr>
+          <w:rFonts w:ascii="Arial" w:hAnsi="Arial" w:cs="Arial"/>
+        </w:rPr>
+        <w:t xml:space="preserve"> Serviço vinculado.</w:t>
+      </w:r>
+    </w:p>
+    <w:p>
+      <w:pPr>
+        <w:numPr>
+          <w:ilvl w:val="0"/>
+          <w:numId w:val="25"/>
+        </w:numPr>
+        <w:jc w:val="both"/>
+        <w:rPr>
+          <w:rFonts w:ascii="Arial" w:hAnsi="Arial" w:cs="Arial"/>
+        </w:rPr>
+      </w:pPr>
+      <w:r>
+        <w:rPr>
+          <w:rFonts w:ascii="Arial" w:hAnsi="Arial" w:cs="Arial"/>
+          <w:b/>
+          <w:bCs/>
+        </w:rPr>
+        <w:t>Passos:</w:t>
+      </w:r>
+    </w:p>
+    <w:p>
+      <w:pPr>
+        <w:numPr>
+          <w:ilvl w:val="1"/>
+          <w:numId w:val="25"/>
+        </w:numPr>
+        <w:jc w:val="both"/>
+        <w:rPr>
+          <w:rFonts w:ascii="Arial" w:hAnsi="Arial" w:cs="Arial"/>
+        </w:rPr>
+      </w:pPr>
+      <w:r>
+        <w:rPr>
+          <w:rFonts w:ascii="Arial" w:hAnsi="Arial" w:cs="Arial"/>
+        </w:rPr>
+        <w:t>Acessar lista de serviços;</w:t>
+      </w:r>
+    </w:p>
+    <w:p>
+      <w:pPr>
+        <w:numPr>
+          <w:ilvl w:val="1"/>
+          <w:numId w:val="25"/>
+        </w:numPr>
+        <w:jc w:val="both"/>
+        <w:rPr>
+          <w:rFonts w:ascii="Arial" w:hAnsi="Arial" w:cs="Arial"/>
+        </w:rPr>
+      </w:pPr>
+      <w:r>
+        <w:rPr>
+          <w:rFonts w:ascii="Arial" w:hAnsi="Arial" w:cs="Arial"/>
+        </w:rPr>
+        <w:t>Selecionar serviço com histórico;</w:t>
+      </w:r>
+    </w:p>
+    <w:p>
+      <w:pPr>
+        <w:numPr>
+          <w:ilvl w:val="1"/>
+          <w:numId w:val="25"/>
+        </w:numPr>
+        <w:jc w:val="both"/>
+        <w:rPr>
+          <w:rFonts w:ascii="Arial" w:hAnsi="Arial" w:cs="Arial"/>
+        </w:rPr>
+      </w:pPr>
+      <w:r>
+        <w:rPr>
+          <w:rFonts w:ascii="Arial" w:hAnsi="Arial" w:cs="Arial"/>
+        </w:rPr>
+        <w:t>Clicar em "Excluir";</w:t>
+      </w:r>
+    </w:p>
+    <w:p>
+      <w:pPr>
+        <w:numPr>
+          <w:ilvl w:val="0"/>
+          <w:numId w:val="25"/>
+        </w:numPr>
+        <w:jc w:val="both"/>
+        <w:rPr>
+          <w:rFonts w:ascii="Arial" w:hAnsi="Arial" w:cs="Arial"/>
+        </w:rPr>
+      </w:pPr>
+      <w:r>
+        <w:rPr>
+          <w:rFonts w:ascii="Arial" w:hAnsi="Arial" w:cs="Arial"/>
+          <w:b/>
+          <w:bCs/>
+        </w:rPr>
+        <w:t>Resultado esperado:</w:t>
+      </w:r>
+      <w:r>
+        <w:rPr>
+          <w:rFonts w:ascii="Arial" w:hAnsi="Arial" w:cs="Arial"/>
+        </w:rPr>
+        <w:t xml:space="preserve"> Sistema exibe mensagem de bloqueio e impede exclusão.</w:t>
+      </w:r>
+    </w:p>
+    <w:p>
+      <w:pPr>
+        <w:numPr>
+          <w:ilvl w:val="0"/>
+          <w:numId w:val="25"/>
+        </w:numPr>
+        <w:jc w:val="both"/>
+        <w:rPr>
+          <w:rFonts w:ascii="Arial" w:hAnsi="Arial" w:cs="Arial"/>
+        </w:rPr>
+      </w:pPr>
+      <w:r>
+        <w:rPr>
+          <w:rFonts w:ascii="Arial" w:hAnsi="Arial" w:cs="Arial"/>
+          <w:b/>
+          <w:bCs/>
+        </w:rPr>
+        <w:t>Responsável pela Execução:</w:t>
+      </w:r>
+    </w:p>
+    <w:p>
+      <w:pPr>
+        <w:numPr>
+          <w:ilvl w:val="0"/>
+          <w:numId w:val="25"/>
+        </w:numPr>
+        <w:jc w:val="both"/>
+        <w:rPr>
+          <w:rFonts w:ascii="Arial" w:hAnsi="Arial" w:cs="Arial"/>
+        </w:rPr>
+      </w:pPr>
+      <w:r>
+        <w:rPr>
+          <w:rFonts w:ascii="Arial" w:hAnsi="Arial" w:cs="Arial"/>
+          <w:b/>
+          <w:bCs/>
+        </w:rPr>
+        <w:t>Resultado Obtido:</w:t>
+      </w:r>
+    </w:p>
+    <w:p>
+      <w:pPr>
+        <w:numPr>
+          <w:ilvl w:val="0"/>
+          <w:numId w:val="25"/>
+        </w:numPr>
+        <w:jc w:val="both"/>
+        <w:rPr>
+          <w:rFonts w:ascii="Arial" w:hAnsi="Arial" w:cs="Arial"/>
+        </w:rPr>
+      </w:pPr>
+      <w:r>
+        <w:rPr>
+          <w:rFonts w:ascii="Arial" w:hAnsi="Arial" w:cs="Arial"/>
+          <w:b/>
+          <w:bCs/>
+        </w:rPr>
+        <w:t>Tempo de Execução:</w:t>
+      </w:r>
+    </w:p>
+    <w:p>
+      <w:pPr>
+        <w:numPr>
+          <w:ilvl w:val="0"/>
+          <w:numId w:val="25"/>
+        </w:numPr>
+        <w:jc w:val="both"/>
+        <w:rPr>
+          <w:rFonts w:ascii="Arial" w:hAnsi="Arial" w:cs="Arial"/>
+        </w:rPr>
+      </w:pPr>
+      <w:r>
+        <w:rPr>
+          <w:rFonts w:ascii="Arial" w:hAnsi="Arial" w:cs="Arial"/>
+          <w:b/>
+          <w:bCs/>
+        </w:rPr>
+        <w:t>Observações:</w:t>
+      </w:r>
+    </w:p>
+    <w:p>
+      <w:pPr>
+        <w:numPr>
+          <w:ilvl w:val="0"/>
+          <w:numId w:val="25"/>
+        </w:numPr>
+        <w:jc w:val="both"/>
+        <w:rPr>
+          <w:rFonts w:ascii="Arial" w:hAnsi="Arial" w:cs="Arial"/>
+        </w:rPr>
+      </w:pPr>
+      <w:r>
+        <w:rPr>
+          <w:rFonts w:ascii="Arial" w:hAnsi="Arial" w:cs="Arial"/>
+          <w:b/>
+          <w:bCs/>
+        </w:rPr>
+        <w:t>Melhorias Sugeridas:</w:t>
+      </w:r>
+    </w:p>
+    <w:p>
+      <w:pPr>
+        <w:jc w:val="both"/>
+        <w:rPr>
+          <w:rFonts w:ascii="Arial" w:hAnsi="Arial" w:cs="Arial"/>
+        </w:rPr>
+      </w:pPr>
+    </w:p>
+    <w:p>
+      <w:pPr>
+        <w:pStyle w:val="Ttulo2"/>
+        <w:rPr>
+          <w:b/>
+          <w:bCs/>
+        </w:rPr>
+      </w:pPr>
+      <w:r>
+        <w:rPr>
+          <w:b/>
+          <w:bCs/>
+        </w:rPr>
+        <w:t>CT19 – Validar cálculo de receita líquida</w:t>
+      </w:r>
+    </w:p>
+    <w:p>
+      <w:pPr>
+        <w:numPr>
+          <w:ilvl w:val="0"/>
+          <w:numId w:val="26"/>
+        </w:numPr>
+        <w:jc w:val="both"/>
+        <w:rPr>
+          <w:rFonts w:ascii="Arial" w:hAnsi="Arial" w:cs="Arial"/>
+        </w:rPr>
+      </w:pPr>
+      <w:r>
+        <w:rPr>
+          <w:rFonts w:ascii="Arial" w:hAnsi="Arial" w:cs="Arial"/>
+          <w:b/>
+          <w:bCs/>
+        </w:rPr>
+        <w:t>Objetivo:</w:t>
+      </w:r>
+      <w:r>
+        <w:rPr>
+          <w:rFonts w:ascii="Arial" w:hAnsi="Arial" w:cs="Arial"/>
+        </w:rPr>
+        <w:t xml:space="preserve"> Verificar cálculo correto da receita líquida.</w:t>
+      </w:r>
+    </w:p>
+    <w:p>
+      <w:pPr>
+        <w:numPr>
+          <w:ilvl w:val="0"/>
+          <w:numId w:val="26"/>
+        </w:numPr>
+        <w:jc w:val="both"/>
+        <w:rPr>
+          <w:rFonts w:ascii="Arial" w:hAnsi="Arial" w:cs="Arial"/>
+        </w:rPr>
+      </w:pPr>
+      <w:r>
+        <w:rPr>
+          <w:rFonts w:ascii="Arial" w:hAnsi="Arial" w:cs="Arial"/>
+          <w:b/>
+          <w:bCs/>
+        </w:rPr>
+        <w:t>Pré-condições:</w:t>
+      </w:r>
+      <w:r>
+        <w:rPr>
+          <w:rFonts w:ascii="Arial" w:hAnsi="Arial" w:cs="Arial"/>
+        </w:rPr>
+        <w:t xml:space="preserve"> Registro de atendimentos com comissão e taxas cadastradas.</w:t>
+      </w:r>
+    </w:p>
+    <w:p>
+      <w:pPr>
+        <w:numPr>
+          <w:ilvl w:val="0"/>
+          <w:numId w:val="26"/>
+        </w:numPr>
+        <w:jc w:val="both"/>
+        <w:rPr>
+          <w:rFonts w:ascii="Arial" w:hAnsi="Arial" w:cs="Arial"/>
+        </w:rPr>
+      </w:pPr>
+      <w:r>
+        <w:rPr>
+          <w:rFonts w:ascii="Arial" w:hAnsi="Arial" w:cs="Arial"/>
+          <w:b/>
+          <w:bCs/>
+        </w:rPr>
+        <w:t>Entradas:</w:t>
+      </w:r>
+      <w:r>
+        <w:rPr>
+          <w:rFonts w:ascii="Arial" w:hAnsi="Arial" w:cs="Arial"/>
+        </w:rPr>
+        <w:t xml:space="preserve"> Período e tipo de relatório.</w:t>
+      </w:r>
+    </w:p>
+    <w:p>
+      <w:pPr>
+        <w:numPr>
+          <w:ilvl w:val="0"/>
+          <w:numId w:val="26"/>
+        </w:numPr>
+        <w:jc w:val="both"/>
+        <w:rPr>
+          <w:rFonts w:ascii="Arial" w:hAnsi="Arial" w:cs="Arial"/>
+        </w:rPr>
+      </w:pPr>
+      <w:r>
+        <w:rPr>
+          <w:rFonts w:ascii="Arial" w:hAnsi="Arial" w:cs="Arial"/>
+          <w:b/>
+          <w:bCs/>
+        </w:rPr>
+        <w:t>Passos:</w:t>
+      </w:r>
+    </w:p>
+    <w:p>
+      <w:pPr>
+        <w:numPr>
+          <w:ilvl w:val="1"/>
+          <w:numId w:val="26"/>
+        </w:numPr>
+        <w:jc w:val="both"/>
+        <w:rPr>
+          <w:rFonts w:ascii="Arial" w:hAnsi="Arial" w:cs="Arial"/>
+        </w:rPr>
+      </w:pPr>
+      <w:r>
+        <w:rPr>
+          <w:rFonts w:ascii="Arial" w:hAnsi="Arial" w:cs="Arial"/>
+        </w:rPr>
+        <w:t>Registrar múltiplos serviços com comissão;</w:t>
+      </w:r>
+    </w:p>
+    <w:p>
+      <w:pPr>
+        <w:numPr>
+          <w:ilvl w:val="1"/>
+          <w:numId w:val="26"/>
+        </w:numPr>
+        <w:jc w:val="both"/>
+        <w:rPr>
+          <w:rFonts w:ascii="Arial" w:hAnsi="Arial" w:cs="Arial"/>
+        </w:rPr>
+      </w:pPr>
+      <w:r>
+        <w:rPr>
+          <w:rFonts w:ascii="Arial" w:hAnsi="Arial" w:cs="Arial"/>
+        </w:rPr>
+        <w:t>Acessar relatório financeiro;</w:t>
+      </w:r>
+    </w:p>
+    <w:p>
+      <w:pPr>
+        <w:numPr>
+          <w:ilvl w:val="0"/>
+          <w:numId w:val="26"/>
+        </w:numPr>
+        <w:jc w:val="both"/>
+        <w:rPr>
+          <w:rFonts w:ascii="Arial" w:hAnsi="Arial" w:cs="Arial"/>
+        </w:rPr>
+      </w:pPr>
+      <w:r>
+        <w:rPr>
+          <w:rFonts w:ascii="Arial" w:hAnsi="Arial" w:cs="Arial"/>
+          <w:b/>
+          <w:bCs/>
+        </w:rPr>
+        <w:t>Resultado esperado:</w:t>
+      </w:r>
+      <w:r>
+        <w:rPr>
+          <w:rFonts w:ascii="Arial" w:hAnsi="Arial" w:cs="Arial"/>
+        </w:rPr>
+        <w:t xml:space="preserve"> Receita líquida exibida corretamente: Bruta - (comissões + taxas).</w:t>
+      </w:r>
+    </w:p>
+    <w:p>
+      <w:pPr>
+        <w:numPr>
+          <w:ilvl w:val="0"/>
+          <w:numId w:val="26"/>
+        </w:numPr>
+        <w:jc w:val="both"/>
+        <w:rPr>
+          <w:rFonts w:ascii="Arial" w:hAnsi="Arial" w:cs="Arial"/>
+        </w:rPr>
+      </w:pPr>
+      <w:r>
+        <w:rPr>
+          <w:rFonts w:ascii="Arial" w:hAnsi="Arial" w:cs="Arial"/>
+          <w:b/>
+          <w:bCs/>
+        </w:rPr>
+        <w:t>Responsável pela Execução:</w:t>
+      </w:r>
+    </w:p>
+    <w:p>
+      <w:pPr>
+        <w:numPr>
+          <w:ilvl w:val="0"/>
+          <w:numId w:val="26"/>
+        </w:numPr>
+        <w:jc w:val="both"/>
+        <w:rPr>
+          <w:rFonts w:ascii="Arial" w:hAnsi="Arial" w:cs="Arial"/>
+        </w:rPr>
+      </w:pPr>
+      <w:r>
+        <w:rPr>
+          <w:rFonts w:ascii="Arial" w:hAnsi="Arial" w:cs="Arial"/>
+          <w:b/>
+          <w:bCs/>
+        </w:rPr>
+        <w:t>Resultado Obtido:</w:t>
+      </w:r>
+    </w:p>
+    <w:p>
+      <w:pPr>
+        <w:numPr>
+          <w:ilvl w:val="0"/>
+          <w:numId w:val="26"/>
+        </w:numPr>
+        <w:jc w:val="both"/>
+        <w:rPr>
+          <w:rFonts w:ascii="Arial" w:hAnsi="Arial" w:cs="Arial"/>
+        </w:rPr>
+      </w:pPr>
+      <w:r>
+        <w:rPr>
+          <w:rFonts w:ascii="Arial" w:hAnsi="Arial" w:cs="Arial"/>
+          <w:b/>
+          <w:bCs/>
+        </w:rPr>
+        <w:t>Tempo de Execução:</w:t>
+      </w:r>
+    </w:p>
+    <w:p>
+      <w:pPr>
+        <w:numPr>
+          <w:ilvl w:val="0"/>
+          <w:numId w:val="26"/>
+        </w:numPr>
+        <w:jc w:val="both"/>
+        <w:rPr>
+          <w:rFonts w:ascii="Arial" w:hAnsi="Arial" w:cs="Arial"/>
+        </w:rPr>
+      </w:pPr>
+      <w:r>
+        <w:rPr>
+          <w:rFonts w:ascii="Arial" w:hAnsi="Arial" w:cs="Arial"/>
+          <w:b/>
+          <w:bCs/>
+        </w:rPr>
+        <w:lastRenderedPageBreak/>
+        <w:t>Observações:</w:t>
+      </w:r>
+    </w:p>
+    <w:p>
+      <w:pPr>
+        <w:numPr>
+          <w:ilvl w:val="0"/>
+          <w:numId w:val="26"/>
+        </w:numPr>
+        <w:jc w:val="both"/>
+        <w:rPr>
+          <w:rFonts w:ascii="Arial" w:hAnsi="Arial" w:cs="Arial"/>
+        </w:rPr>
+      </w:pPr>
+      <w:r>
+        <w:rPr>
+          <w:rFonts w:ascii="Arial" w:hAnsi="Arial" w:cs="Arial"/>
+          <w:b/>
+          <w:bCs/>
+        </w:rPr>
+        <w:t>Melhorias Sugeridas:</w:t>
+      </w:r>
+    </w:p>
+    <w:p>
+      <w:pPr>
+        <w:jc w:val="both"/>
+        <w:rPr>
+          <w:rFonts w:ascii="Arial" w:hAnsi="Arial" w:cs="Arial"/>
+        </w:rPr>
+      </w:pPr>
+    </w:p>
+    <w:p>
+      <w:pPr>
+        <w:pStyle w:val="Ttulo2"/>
+        <w:rPr>
+          <w:b/>
+          <w:bCs/>
+        </w:rPr>
+      </w:pPr>
+      <w:r>
+        <w:rPr>
+          <w:b/>
+          <w:bCs/>
+        </w:rPr>
+        <w:t>CT20 – Verificar acessibilidade e contraste da interface</w:t>
+      </w:r>
+    </w:p>
+    <w:p>
+      <w:pPr>
+        <w:numPr>
+          <w:ilvl w:val="0"/>
+          <w:numId w:val="27"/>
+        </w:numPr>
+        <w:jc w:val="both"/>
+        <w:rPr>
+          <w:rFonts w:ascii="Arial" w:hAnsi="Arial" w:cs="Arial"/>
+        </w:rPr>
+      </w:pPr>
+      <w:r>
+        <w:rPr>
+          <w:rFonts w:ascii="Arial" w:hAnsi="Arial" w:cs="Arial"/>
+          <w:b/>
+          <w:bCs/>
+        </w:rPr>
+        <w:t>Objetivo:</w:t>
+      </w:r>
+      <w:r>
+        <w:rPr>
+          <w:rFonts w:ascii="Arial" w:hAnsi="Arial" w:cs="Arial"/>
+        </w:rPr>
+        <w:t xml:space="preserve"> Garantir usabilidade para usuários com limitações visuais.</w:t>
+      </w:r>
+    </w:p>
+    <w:p>
+      <w:pPr>
+        <w:numPr>
+          <w:ilvl w:val="0"/>
+          <w:numId w:val="27"/>
+        </w:numPr>
+        <w:jc w:val="both"/>
+        <w:rPr>
+          <w:rFonts w:ascii="Arial" w:hAnsi="Arial" w:cs="Arial"/>
+        </w:rPr>
+      </w:pPr>
+      <w:r>
+        <w:rPr>
+          <w:rFonts w:ascii="Arial" w:hAnsi="Arial" w:cs="Arial"/>
+          <w:b/>
+          <w:bCs/>
+        </w:rPr>
+        <w:t>Pré-condições:</w:t>
+      </w:r>
+      <w:r>
+        <w:rPr>
+          <w:rFonts w:ascii="Arial" w:hAnsi="Arial" w:cs="Arial"/>
+        </w:rPr>
+        <w:t xml:space="preserve"> Sistema acessível.</w:t>
+      </w:r>
+    </w:p>
+    <w:p>
+      <w:pPr>
+        <w:numPr>
+          <w:ilvl w:val="0"/>
+          <w:numId w:val="27"/>
+        </w:numPr>
+        <w:jc w:val="both"/>
+        <w:rPr>
+          <w:rFonts w:ascii="Arial" w:hAnsi="Arial" w:cs="Arial"/>
+        </w:rPr>
+      </w:pPr>
+      <w:r>
+        <w:rPr>
+          <w:rFonts w:ascii="Arial" w:hAnsi="Arial" w:cs="Arial"/>
+          <w:b/>
+          <w:bCs/>
+        </w:rPr>
+        <w:t>Entradas:</w:t>
+      </w:r>
+      <w:r>
+        <w:rPr>
+          <w:rFonts w:ascii="Arial" w:hAnsi="Arial" w:cs="Arial"/>
+        </w:rPr>
+        <w:t xml:space="preserve"> Interface em modo alto contraste.</w:t>
+      </w:r>
+    </w:p>
+    <w:p>
+      <w:pPr>
+        <w:numPr>
+          <w:ilvl w:val="0"/>
+          <w:numId w:val="27"/>
+        </w:numPr>
+        <w:jc w:val="both"/>
+        <w:rPr>
+          <w:rFonts w:ascii="Arial" w:hAnsi="Arial" w:cs="Arial"/>
+        </w:rPr>
+      </w:pPr>
+      <w:r>
+        <w:rPr>
+          <w:rFonts w:ascii="Arial" w:hAnsi="Arial" w:cs="Arial"/>
+          <w:b/>
+          <w:bCs/>
+        </w:rPr>
+        <w:t>Passos:</w:t>
+      </w:r>
+    </w:p>
+    <w:p>
+      <w:pPr>
+        <w:numPr>
+          <w:ilvl w:val="1"/>
+          <w:numId w:val="27"/>
+        </w:numPr>
+        <w:jc w:val="both"/>
+        <w:rPr>
+          <w:rFonts w:ascii="Arial" w:hAnsi="Arial" w:cs="Arial"/>
+        </w:rPr>
+      </w:pPr>
+      <w:r>
+        <w:rPr>
+          <w:rFonts w:ascii="Arial" w:hAnsi="Arial" w:cs="Arial"/>
+        </w:rPr>
+        <w:t>Ativar modo de alto contraste no dispositivo;</w:t>
+      </w:r>
+    </w:p>
+    <w:p>
+      <w:pPr>
+        <w:numPr>
+          <w:ilvl w:val="1"/>
+          <w:numId w:val="27"/>
+        </w:numPr>
+        <w:jc w:val="both"/>
+        <w:rPr>
+          <w:rFonts w:ascii="Arial" w:hAnsi="Arial" w:cs="Arial"/>
+        </w:rPr>
+      </w:pPr>
+      <w:r>
+        <w:rPr>
+          <w:rFonts w:ascii="Arial" w:hAnsi="Arial" w:cs="Arial"/>
+        </w:rPr>
+        <w:t>Navegar pelas principais telas;</w:t>
+      </w:r>
+    </w:p>
+    <w:p>
+      <w:pPr>
+        <w:numPr>
+          <w:ilvl w:val="0"/>
+          <w:numId w:val="27"/>
+        </w:numPr>
+        <w:jc w:val="both"/>
+        <w:rPr>
+          <w:rFonts w:ascii="Arial" w:hAnsi="Arial" w:cs="Arial"/>
+        </w:rPr>
+      </w:pPr>
+      <w:r>
+        <w:rPr>
+          <w:rFonts w:ascii="Arial" w:hAnsi="Arial" w:cs="Arial"/>
+          <w:b/>
+          <w:bCs/>
+        </w:rPr>
+        <w:t>Resultado esperado:</w:t>
+      </w:r>
+      <w:r>
+        <w:rPr>
+          <w:rFonts w:ascii="Arial" w:hAnsi="Arial" w:cs="Arial"/>
+        </w:rPr>
+        <w:t xml:space="preserve"> Todos os elementos permanecem visíveis e legíveis.</w:t>
+      </w:r>
+    </w:p>
+    <w:p>
+      <w:pPr>
+        <w:numPr>
+          <w:ilvl w:val="0"/>
+          <w:numId w:val="27"/>
+        </w:numPr>
+        <w:jc w:val="both"/>
+        <w:rPr>
+          <w:rFonts w:ascii="Arial" w:hAnsi="Arial" w:cs="Arial"/>
+        </w:rPr>
+      </w:pPr>
+      <w:r>
+        <w:rPr>
+          <w:rFonts w:ascii="Arial" w:hAnsi="Arial" w:cs="Arial"/>
+          <w:b/>
+          <w:bCs/>
+        </w:rPr>
+        <w:t>Responsável pela Execução:</w:t>
+      </w:r>
+    </w:p>
+    <w:p>
+      <w:pPr>
+        <w:numPr>
+          <w:ilvl w:val="0"/>
+          <w:numId w:val="27"/>
+        </w:numPr>
+        <w:jc w:val="both"/>
+        <w:rPr>
+          <w:rFonts w:ascii="Arial" w:hAnsi="Arial" w:cs="Arial"/>
+        </w:rPr>
+      </w:pPr>
+      <w:r>
+        <w:rPr>
+          <w:rFonts w:ascii="Arial" w:hAnsi="Arial" w:cs="Arial"/>
+          <w:b/>
+          <w:bCs/>
+        </w:rPr>
+        <w:t>Resultado Obtido:</w:t>
+      </w:r>
+    </w:p>
+    <w:p>
+      <w:pPr>
+        <w:numPr>
+          <w:ilvl w:val="0"/>
+          <w:numId w:val="27"/>
+        </w:numPr>
+        <w:jc w:val="both"/>
+        <w:rPr>
+          <w:rFonts w:ascii="Arial" w:hAnsi="Arial" w:cs="Arial"/>
+        </w:rPr>
+      </w:pPr>
+      <w:r>
+        <w:rPr>
+          <w:rFonts w:ascii="Arial" w:hAnsi="Arial" w:cs="Arial"/>
+          <w:b/>
+          <w:bCs/>
+        </w:rPr>
+        <w:t>Tempo de Execução:</w:t>
+      </w:r>
+    </w:p>
+    <w:p>
+      <w:pPr>
+        <w:numPr>
+          <w:ilvl w:val="0"/>
+          <w:numId w:val="27"/>
+        </w:numPr>
+        <w:jc w:val="both"/>
+        <w:rPr>
+          <w:rFonts w:ascii="Arial" w:hAnsi="Arial" w:cs="Arial"/>
+        </w:rPr>
+      </w:pPr>
+      <w:r>
+        <w:rPr>
+          <w:rFonts w:ascii="Arial" w:hAnsi="Arial" w:cs="Arial"/>
+          <w:b/>
+          <w:bCs/>
+        </w:rPr>
+        <w:t>Observações:</w:t>
+      </w:r>
+    </w:p>
+    <w:p>
+      <w:pPr>
+        <w:numPr>
+          <w:ilvl w:val="0"/>
+          <w:numId w:val="27"/>
         </w:numPr>
         <w:jc w:val="both"/>
         <w:rPr>
@@ -4061,6 +7073,296 @@
 <file path=word/numbering.xml><?xml version="1.0" encoding="utf-8"?>
 <w:numbering xmlns:wpc="http://schemas.microsoft.com/office/word/2010/wordprocessingCanvas" xmlns:cx="http://schemas.microsoft.com/office/drawing/2014/chartex" xmlns:cx1="http://schemas.microsoft.com/office/drawing/2015/9/8/chartex" xmlns:cx2="http://schemas.microsoft.com/office/drawing/2015/10/21/chartex" xmlns:cx3="http://schemas.microsoft.com/office/drawing/2016/5/9/chartex" xmlns:cx4="http://schemas.microsoft.com/office/drawing/2016/5/10/chartex" xmlns:cx5="http://schemas.microsoft.com/office/drawing/2016/5/11/chartex" xmlns:cx6="http://schemas.microsoft.com/office/drawing/2016/5/12/chartex" xmlns:cx7="http://schemas.microsoft.com/office/drawing/2016/5/13/chartex" xmlns:cx8="http://schemas.microsoft.com/office/drawing/2016/5/14/chartex" xmlns:mc="http://schemas.openxmlformats.org/markup-compatibility/2006" xmlns:aink="http://schemas.microsoft.com/office/drawing/2016/ink" xmlns:am3d="http://schemas.microsoft.com/office/drawing/2017/model3d" xmlns:o="urn:schemas-microsoft-com:office:office" xmlns:oel="http://schemas.microsoft.com/office/2019/extlst" xmlns:r="http://schemas.openxmlformats.org/officeDocument/2006/relationships" xmlns:m="http://schemas.openxmlformats.org/officeDocument/2006/math" xmlns:v="urn:schemas-microsoft-com:vml" xmlns:wp14="http://schemas.microsoft.com/office/word/2010/wordprocessingDrawing" xmlns:wp="http://schemas.openxmlformats.org/drawingml/2006/wordprocessingDrawing" xmlns:w10="urn:schemas-microsoft-com:office:word" xmlns:w="http://schemas.openxmlformats.org/wordprocessingml/2006/main" xmlns:w14="http://schemas.microsoft.com/office/word/2010/wordml" xmlns:w15="http://schemas.microsoft.com/office/word/2012/wordml" xmlns:w16cex="http://schemas.microsoft.com/office/word/2018/wordml/cex" xmlns:w16cid="http://schemas.microsoft.com/office/word/2016/wordml/cid" xmlns:w16="http://schemas.microsoft.com/office/word/2018/wordml" xmlns:w16sdtdh="http://schemas.microsoft.com/office/word/2020/wordml/sdtdatahash" xmlns:w16se="http://schemas.microsoft.com/office/word/2015/wordml/symex" xmlns:wpg="http://schemas.microsoft.com/office/word/2010/wordprocessingGroup" xmlns:wpi="http://schemas.microsoft.com/office/word/2010/wordprocessingInk" xmlns:wne="http://schemas.microsoft.com/office/word/2006/wordml" xmlns:wps="http://schemas.microsoft.com/office/word/2010/wordprocessingShape" mc:Ignorable="w14 w15 w16se w16cid w16 w16cex w16sdtdh wp14">
   <w:abstractNum w:abstractNumId="0" w15:restartNumberingAfterBreak="0">
+    <w:nsid w:val="00962B35"/>
+    <w:multiLevelType w:val="multilevel"/>
+    <w:tmpl w:val="7F6277FA"/>
+    <w:lvl w:ilvl="0">
+      <w:start w:val="1"/>
+      <w:numFmt w:val="bullet"/>
+      <w:lvlText w:val=""/>
+      <w:lvlJc w:val="left"/>
+      <w:pPr>
+        <w:tabs>
+          <w:tab w:val="num" w:pos="720"/>
+        </w:tabs>
+        <w:ind w:left="720" w:hanging="360"/>
+      </w:pPr>
+      <w:rPr>
+        <w:rFonts w:ascii="Symbol" w:hAnsi="Symbol" w:hint="default"/>
+        <w:sz w:val="20"/>
+      </w:rPr>
+    </w:lvl>
+    <w:lvl w:ilvl="1">
+      <w:start w:val="1"/>
+      <w:numFmt w:val="decimal"/>
+      <w:lvlText w:val="%2."/>
+      <w:lvlJc w:val="left"/>
+      <w:pPr>
+        <w:tabs>
+          <w:tab w:val="num" w:pos="1440"/>
+        </w:tabs>
+        <w:ind w:left="1440" w:hanging="360"/>
+      </w:pPr>
+    </w:lvl>
+    <w:lvl w:ilvl="2" w:tentative="1">
+      <w:start w:val="1"/>
+      <w:numFmt w:val="bullet"/>
+      <w:lvlText w:val=""/>
+      <w:lvlJc w:val="left"/>
+      <w:pPr>
+        <w:tabs>
+          <w:tab w:val="num" w:pos="2160"/>
+        </w:tabs>
+        <w:ind w:left="2160" w:hanging="360"/>
+      </w:pPr>
+      <w:rPr>
+        <w:rFonts w:ascii="Wingdings" w:hAnsi="Wingdings" w:hint="default"/>
+        <w:sz w:val="20"/>
+      </w:rPr>
+    </w:lvl>
+    <w:lvl w:ilvl="3" w:tentative="1">
+      <w:start w:val="1"/>
+      <w:numFmt w:val="bullet"/>
+      <w:lvlText w:val=""/>
+      <w:lvlJc w:val="left"/>
+      <w:pPr>
+        <w:tabs>
+          <w:tab w:val="num" w:pos="2880"/>
+        </w:tabs>
+        <w:ind w:left="2880" w:hanging="360"/>
+      </w:pPr>
+      <w:rPr>
+        <w:rFonts w:ascii="Wingdings" w:hAnsi="Wingdings" w:hint="default"/>
+        <w:sz w:val="20"/>
+      </w:rPr>
+    </w:lvl>
+    <w:lvl w:ilvl="4" w:tentative="1">
+      <w:start w:val="1"/>
+      <w:numFmt w:val="bullet"/>
+      <w:lvlText w:val=""/>
+      <w:lvlJc w:val="left"/>
+      <w:pPr>
+        <w:tabs>
+          <w:tab w:val="num" w:pos="3600"/>
+        </w:tabs>
+        <w:ind w:left="3600" w:hanging="360"/>
+      </w:pPr>
+      <w:rPr>
+        <w:rFonts w:ascii="Wingdings" w:hAnsi="Wingdings" w:hint="default"/>
+        <w:sz w:val="20"/>
+      </w:rPr>
+    </w:lvl>
+    <w:lvl w:ilvl="5" w:tentative="1">
+      <w:start w:val="1"/>
+      <w:numFmt w:val="bullet"/>
+      <w:lvlText w:val=""/>
+      <w:lvlJc w:val="left"/>
+      <w:pPr>
+        <w:tabs>
+          <w:tab w:val="num" w:pos="4320"/>
+        </w:tabs>
+        <w:ind w:left="4320" w:hanging="360"/>
+      </w:pPr>
+      <w:rPr>
+        <w:rFonts w:ascii="Wingdings" w:hAnsi="Wingdings" w:hint="default"/>
+        <w:sz w:val="20"/>
+      </w:rPr>
+    </w:lvl>
+    <w:lvl w:ilvl="6" w:tentative="1">
+      <w:start w:val="1"/>
+      <w:numFmt w:val="bullet"/>
+      <w:lvlText w:val=""/>
+      <w:lvlJc w:val="left"/>
+      <w:pPr>
+        <w:tabs>
+          <w:tab w:val="num" w:pos="5040"/>
+        </w:tabs>
+        <w:ind w:left="5040" w:hanging="360"/>
+      </w:pPr>
+      <w:rPr>
+        <w:rFonts w:ascii="Wingdings" w:hAnsi="Wingdings" w:hint="default"/>
+        <w:sz w:val="20"/>
+      </w:rPr>
+    </w:lvl>
+    <w:lvl w:ilvl="7" w:tentative="1">
+      <w:start w:val="1"/>
+      <w:numFmt w:val="bullet"/>
+      <w:lvlText w:val=""/>
+      <w:lvlJc w:val="left"/>
+      <w:pPr>
+        <w:tabs>
+          <w:tab w:val="num" w:pos="5760"/>
+        </w:tabs>
+        <w:ind w:left="5760" w:hanging="360"/>
+      </w:pPr>
+      <w:rPr>
+        <w:rFonts w:ascii="Wingdings" w:hAnsi="Wingdings" w:hint="default"/>
+        <w:sz w:val="20"/>
+      </w:rPr>
+    </w:lvl>
+    <w:lvl w:ilvl="8" w:tentative="1">
+      <w:start w:val="1"/>
+      <w:numFmt w:val="bullet"/>
+      <w:lvlText w:val=""/>
+      <w:lvlJc w:val="left"/>
+      <w:pPr>
+        <w:tabs>
+          <w:tab w:val="num" w:pos="6480"/>
+        </w:tabs>
+        <w:ind w:left="6480" w:hanging="360"/>
+      </w:pPr>
+      <w:rPr>
+        <w:rFonts w:ascii="Wingdings" w:hAnsi="Wingdings" w:hint="default"/>
+        <w:sz w:val="20"/>
+      </w:rPr>
+    </w:lvl>
+  </w:abstractNum>
+  <w:abstractNum w:abstractNumId="1" w15:restartNumberingAfterBreak="0">
+    <w:nsid w:val="0B9740CB"/>
+    <w:multiLevelType w:val="multilevel"/>
+    <w:tmpl w:val="E83265BA"/>
+    <w:lvl w:ilvl="0">
+      <w:start w:val="1"/>
+      <w:numFmt w:val="bullet"/>
+      <w:lvlText w:val=""/>
+      <w:lvlJc w:val="left"/>
+      <w:pPr>
+        <w:tabs>
+          <w:tab w:val="num" w:pos="720"/>
+        </w:tabs>
+        <w:ind w:left="720" w:hanging="360"/>
+      </w:pPr>
+      <w:rPr>
+        <w:rFonts w:ascii="Symbol" w:hAnsi="Symbol" w:hint="default"/>
+        <w:sz w:val="20"/>
+      </w:rPr>
+    </w:lvl>
+    <w:lvl w:ilvl="1">
+      <w:start w:val="1"/>
+      <w:numFmt w:val="decimal"/>
+      <w:lvlText w:val="%2."/>
+      <w:lvlJc w:val="left"/>
+      <w:pPr>
+        <w:tabs>
+          <w:tab w:val="num" w:pos="1440"/>
+        </w:tabs>
+        <w:ind w:left="1440" w:hanging="360"/>
+      </w:pPr>
+    </w:lvl>
+    <w:lvl w:ilvl="2" w:tentative="1">
+      <w:start w:val="1"/>
+      <w:numFmt w:val="bullet"/>
+      <w:lvlText w:val=""/>
+      <w:lvlJc w:val="left"/>
+      <w:pPr>
+        <w:tabs>
+          <w:tab w:val="num" w:pos="2160"/>
+        </w:tabs>
+        <w:ind w:left="2160" w:hanging="360"/>
+      </w:pPr>
+      <w:rPr>
+        <w:rFonts w:ascii="Wingdings" w:hAnsi="Wingdings" w:hint="default"/>
+        <w:sz w:val="20"/>
+      </w:rPr>
+    </w:lvl>
+    <w:lvl w:ilvl="3" w:tentative="1">
+      <w:start w:val="1"/>
+      <w:numFmt w:val="bullet"/>
+      <w:lvlText w:val=""/>
+      <w:lvlJc w:val="left"/>
+      <w:pPr>
+        <w:tabs>
+          <w:tab w:val="num" w:pos="2880"/>
+        </w:tabs>
+        <w:ind w:left="2880" w:hanging="360"/>
+      </w:pPr>
+      <w:rPr>
+        <w:rFonts w:ascii="Wingdings" w:hAnsi="Wingdings" w:hint="default"/>
+        <w:sz w:val="20"/>
+      </w:rPr>
+    </w:lvl>
+    <w:lvl w:ilvl="4" w:tentative="1">
+      <w:start w:val="1"/>
+      <w:numFmt w:val="bullet"/>
+      <w:lvlText w:val=""/>
+      <w:lvlJc w:val="left"/>
+      <w:pPr>
+        <w:tabs>
+          <w:tab w:val="num" w:pos="3600"/>
+        </w:tabs>
+        <w:ind w:left="3600" w:hanging="360"/>
+      </w:pPr>
+      <w:rPr>
+        <w:rFonts w:ascii="Wingdings" w:hAnsi="Wingdings" w:hint="default"/>
+        <w:sz w:val="20"/>
+      </w:rPr>
+    </w:lvl>
+    <w:lvl w:ilvl="5" w:tentative="1">
+      <w:start w:val="1"/>
+      <w:numFmt w:val="bullet"/>
+      <w:lvlText w:val=""/>
+      <w:lvlJc w:val="left"/>
+      <w:pPr>
+        <w:tabs>
+          <w:tab w:val="num" w:pos="4320"/>
+        </w:tabs>
+        <w:ind w:left="4320" w:hanging="360"/>
+      </w:pPr>
+      <w:rPr>
+        <w:rFonts w:ascii="Wingdings" w:hAnsi="Wingdings" w:hint="default"/>
+        <w:sz w:val="20"/>
+      </w:rPr>
+    </w:lvl>
+    <w:lvl w:ilvl="6" w:tentative="1">
+      <w:start w:val="1"/>
+      <w:numFmt w:val="bullet"/>
+      <w:lvlText w:val=""/>
+      <w:lvlJc w:val="left"/>
+      <w:pPr>
+        <w:tabs>
+          <w:tab w:val="num" w:pos="5040"/>
+        </w:tabs>
+        <w:ind w:left="5040" w:hanging="360"/>
+      </w:pPr>
+      <w:rPr>
+        <w:rFonts w:ascii="Wingdings" w:hAnsi="Wingdings" w:hint="default"/>
+        <w:sz w:val="20"/>
+      </w:rPr>
+    </w:lvl>
+    <w:lvl w:ilvl="7" w:tentative="1">
+      <w:start w:val="1"/>
+      <w:numFmt w:val="bullet"/>
+      <w:lvlText w:val=""/>
+      <w:lvlJc w:val="left"/>
+      <w:pPr>
+        <w:tabs>
+          <w:tab w:val="num" w:pos="5760"/>
+        </w:tabs>
+        <w:ind w:left="5760" w:hanging="360"/>
+      </w:pPr>
+      <w:rPr>
+        <w:rFonts w:ascii="Wingdings" w:hAnsi="Wingdings" w:hint="default"/>
+        <w:sz w:val="20"/>
+      </w:rPr>
+    </w:lvl>
+    <w:lvl w:ilvl="8" w:tentative="1">
+      <w:start w:val="1"/>
+      <w:numFmt w:val="bullet"/>
+      <w:lvlText w:val=""/>
+      <w:lvlJc w:val="left"/>
+      <w:pPr>
+        <w:tabs>
+          <w:tab w:val="num" w:pos="6480"/>
+        </w:tabs>
+        <w:ind w:left="6480" w:hanging="360"/>
+      </w:pPr>
+      <w:rPr>
+        <w:rFonts w:ascii="Wingdings" w:hAnsi="Wingdings" w:hint="default"/>
+        <w:sz w:val="20"/>
+      </w:rPr>
+    </w:lvl>
+  </w:abstractNum>
+  <w:abstractNum w:abstractNumId="2" w15:restartNumberingAfterBreak="0">
     <w:nsid w:val="0E354979"/>
     <w:multiLevelType w:val="multilevel"/>
     <w:tmpl w:val="DFCEA73C"/>
@@ -4209,7 +7511,7 @@
       </w:rPr>
     </w:lvl>
   </w:abstractNum>
-  <w:abstractNum w:abstractNumId="1" w15:restartNumberingAfterBreak="0">
+  <w:abstractNum w:abstractNumId="3" w15:restartNumberingAfterBreak="0">
     <w:nsid w:val="10205232"/>
     <w:multiLevelType w:val="multilevel"/>
     <w:tmpl w:val="3BCA2102"/>
@@ -4354,7 +7656,152 @@
       </w:rPr>
     </w:lvl>
   </w:abstractNum>
-  <w:abstractNum w:abstractNumId="2" w15:restartNumberingAfterBreak="0">
+  <w:abstractNum w:abstractNumId="4" w15:restartNumberingAfterBreak="0">
+    <w:nsid w:val="16781BB9"/>
+    <w:multiLevelType w:val="multilevel"/>
+    <w:tmpl w:val="81DC466C"/>
+    <w:lvl w:ilvl="0">
+      <w:start w:val="1"/>
+      <w:numFmt w:val="bullet"/>
+      <w:lvlText w:val=""/>
+      <w:lvlJc w:val="left"/>
+      <w:pPr>
+        <w:tabs>
+          <w:tab w:val="num" w:pos="720"/>
+        </w:tabs>
+        <w:ind w:left="720" w:hanging="360"/>
+      </w:pPr>
+      <w:rPr>
+        <w:rFonts w:ascii="Symbol" w:hAnsi="Symbol" w:hint="default"/>
+        <w:sz w:val="20"/>
+      </w:rPr>
+    </w:lvl>
+    <w:lvl w:ilvl="1">
+      <w:start w:val="1"/>
+      <w:numFmt w:val="decimal"/>
+      <w:lvlText w:val="%2."/>
+      <w:lvlJc w:val="left"/>
+      <w:pPr>
+        <w:tabs>
+          <w:tab w:val="num" w:pos="1440"/>
+        </w:tabs>
+        <w:ind w:left="1440" w:hanging="360"/>
+      </w:pPr>
+    </w:lvl>
+    <w:lvl w:ilvl="2" w:tentative="1">
+      <w:start w:val="1"/>
+      <w:numFmt w:val="bullet"/>
+      <w:lvlText w:val=""/>
+      <w:lvlJc w:val="left"/>
+      <w:pPr>
+        <w:tabs>
+          <w:tab w:val="num" w:pos="2160"/>
+        </w:tabs>
+        <w:ind w:left="2160" w:hanging="360"/>
+      </w:pPr>
+      <w:rPr>
+        <w:rFonts w:ascii="Wingdings" w:hAnsi="Wingdings" w:hint="default"/>
+        <w:sz w:val="20"/>
+      </w:rPr>
+    </w:lvl>
+    <w:lvl w:ilvl="3" w:tentative="1">
+      <w:start w:val="1"/>
+      <w:numFmt w:val="bullet"/>
+      <w:lvlText w:val=""/>
+      <w:lvlJc w:val="left"/>
+      <w:pPr>
+        <w:tabs>
+          <w:tab w:val="num" w:pos="2880"/>
+        </w:tabs>
+        <w:ind w:left="2880" w:hanging="360"/>
+      </w:pPr>
+      <w:rPr>
+        <w:rFonts w:ascii="Wingdings" w:hAnsi="Wingdings" w:hint="default"/>
+        <w:sz w:val="20"/>
+      </w:rPr>
+    </w:lvl>
+    <w:lvl w:ilvl="4" w:tentative="1">
+      <w:start w:val="1"/>
+      <w:numFmt w:val="bullet"/>
+      <w:lvlText w:val=""/>
+      <w:lvlJc w:val="left"/>
+      <w:pPr>
+        <w:tabs>
+          <w:tab w:val="num" w:pos="3600"/>
+        </w:tabs>
+        <w:ind w:left="3600" w:hanging="360"/>
+      </w:pPr>
+      <w:rPr>
+        <w:rFonts w:ascii="Wingdings" w:hAnsi="Wingdings" w:hint="default"/>
+        <w:sz w:val="20"/>
+      </w:rPr>
+    </w:lvl>
+    <w:lvl w:ilvl="5" w:tentative="1">
+      <w:start w:val="1"/>
+      <w:numFmt w:val="bullet"/>
+      <w:lvlText w:val=""/>
+      <w:lvlJc w:val="left"/>
+      <w:pPr>
+        <w:tabs>
+          <w:tab w:val="num" w:pos="4320"/>
+        </w:tabs>
+        <w:ind w:left="4320" w:hanging="360"/>
+      </w:pPr>
+      <w:rPr>
+        <w:rFonts w:ascii="Wingdings" w:hAnsi="Wingdings" w:hint="default"/>
+        <w:sz w:val="20"/>
+      </w:rPr>
+    </w:lvl>
+    <w:lvl w:ilvl="6" w:tentative="1">
+      <w:start w:val="1"/>
+      <w:numFmt w:val="bullet"/>
+      <w:lvlText w:val=""/>
+      <w:lvlJc w:val="left"/>
+      <w:pPr>
+        <w:tabs>
+          <w:tab w:val="num" w:pos="5040"/>
+        </w:tabs>
+        <w:ind w:left="5040" w:hanging="360"/>
+      </w:pPr>
+      <w:rPr>
+        <w:rFonts w:ascii="Wingdings" w:hAnsi="Wingdings" w:hint="default"/>
+        <w:sz w:val="20"/>
+      </w:rPr>
+    </w:lvl>
+    <w:lvl w:ilvl="7" w:tentative="1">
+      <w:start w:val="1"/>
+      <w:numFmt w:val="bullet"/>
+      <w:lvlText w:val=""/>
+      <w:lvlJc w:val="left"/>
+      <w:pPr>
+        <w:tabs>
+          <w:tab w:val="num" w:pos="5760"/>
+        </w:tabs>
+        <w:ind w:left="5760" w:hanging="360"/>
+      </w:pPr>
+      <w:rPr>
+        <w:rFonts w:ascii="Wingdings" w:hAnsi="Wingdings" w:hint="default"/>
+        <w:sz w:val="20"/>
+      </w:rPr>
+    </w:lvl>
+    <w:lvl w:ilvl="8" w:tentative="1">
+      <w:start w:val="1"/>
+      <w:numFmt w:val="bullet"/>
+      <w:lvlText w:val=""/>
+      <w:lvlJc w:val="left"/>
+      <w:pPr>
+        <w:tabs>
+          <w:tab w:val="num" w:pos="6480"/>
+        </w:tabs>
+        <w:ind w:left="6480" w:hanging="360"/>
+      </w:pPr>
+      <w:rPr>
+        <w:rFonts w:ascii="Wingdings" w:hAnsi="Wingdings" w:hint="default"/>
+        <w:sz w:val="20"/>
+      </w:rPr>
+    </w:lvl>
+  </w:abstractNum>
+  <w:abstractNum w:abstractNumId="5" w15:restartNumberingAfterBreak="0">
     <w:nsid w:val="18BB6D5C"/>
     <w:multiLevelType w:val="multilevel"/>
     <w:tmpl w:val="7778A7C4"/>
@@ -4503,7 +7950,7 @@
       </w:rPr>
     </w:lvl>
   </w:abstractNum>
-  <w:abstractNum w:abstractNumId="3" w15:restartNumberingAfterBreak="0">
+  <w:abstractNum w:abstractNumId="6" w15:restartNumberingAfterBreak="0">
     <w:nsid w:val="196D0E87"/>
     <w:multiLevelType w:val="multilevel"/>
     <w:tmpl w:val="EB3E5C0A"/>
@@ -4652,7 +8099,7 @@
       </w:rPr>
     </w:lvl>
   </w:abstractNum>
-  <w:abstractNum w:abstractNumId="4" w15:restartNumberingAfterBreak="0">
+  <w:abstractNum w:abstractNumId="7" w15:restartNumberingAfterBreak="0">
     <w:nsid w:val="19B14910"/>
     <w:multiLevelType w:val="multilevel"/>
     <w:tmpl w:val="5A68D9F6"/>
@@ -4797,7 +8244,7 @@
       </w:rPr>
     </w:lvl>
   </w:abstractNum>
-  <w:abstractNum w:abstractNumId="5" w15:restartNumberingAfterBreak="0">
+  <w:abstractNum w:abstractNumId="8" w15:restartNumberingAfterBreak="0">
     <w:nsid w:val="1BB51F34"/>
     <w:multiLevelType w:val="multilevel"/>
     <w:tmpl w:val="8604EBD8"/>
@@ -4942,7 +8389,297 @@
       </w:rPr>
     </w:lvl>
   </w:abstractNum>
-  <w:abstractNum w:abstractNumId="6" w15:restartNumberingAfterBreak="0">
+  <w:abstractNum w:abstractNumId="9" w15:restartNumberingAfterBreak="0">
+    <w:nsid w:val="21351601"/>
+    <w:multiLevelType w:val="multilevel"/>
+    <w:tmpl w:val="9F5C091E"/>
+    <w:lvl w:ilvl="0">
+      <w:start w:val="1"/>
+      <w:numFmt w:val="bullet"/>
+      <w:lvlText w:val=""/>
+      <w:lvlJc w:val="left"/>
+      <w:pPr>
+        <w:tabs>
+          <w:tab w:val="num" w:pos="720"/>
+        </w:tabs>
+        <w:ind w:left="720" w:hanging="360"/>
+      </w:pPr>
+      <w:rPr>
+        <w:rFonts w:ascii="Symbol" w:hAnsi="Symbol" w:hint="default"/>
+        <w:sz w:val="20"/>
+      </w:rPr>
+    </w:lvl>
+    <w:lvl w:ilvl="1">
+      <w:start w:val="1"/>
+      <w:numFmt w:val="decimal"/>
+      <w:lvlText w:val="%2."/>
+      <w:lvlJc w:val="left"/>
+      <w:pPr>
+        <w:tabs>
+          <w:tab w:val="num" w:pos="1440"/>
+        </w:tabs>
+        <w:ind w:left="1440" w:hanging="360"/>
+      </w:pPr>
+    </w:lvl>
+    <w:lvl w:ilvl="2" w:tentative="1">
+      <w:start w:val="1"/>
+      <w:numFmt w:val="bullet"/>
+      <w:lvlText w:val=""/>
+      <w:lvlJc w:val="left"/>
+      <w:pPr>
+        <w:tabs>
+          <w:tab w:val="num" w:pos="2160"/>
+        </w:tabs>
+        <w:ind w:left="2160" w:hanging="360"/>
+      </w:pPr>
+      <w:rPr>
+        <w:rFonts w:ascii="Wingdings" w:hAnsi="Wingdings" w:hint="default"/>
+        <w:sz w:val="20"/>
+      </w:rPr>
+    </w:lvl>
+    <w:lvl w:ilvl="3" w:tentative="1">
+      <w:start w:val="1"/>
+      <w:numFmt w:val="bullet"/>
+      <w:lvlText w:val=""/>
+      <w:lvlJc w:val="left"/>
+      <w:pPr>
+        <w:tabs>
+          <w:tab w:val="num" w:pos="2880"/>
+        </w:tabs>
+        <w:ind w:left="2880" w:hanging="360"/>
+      </w:pPr>
+      <w:rPr>
+        <w:rFonts w:ascii="Wingdings" w:hAnsi="Wingdings" w:hint="default"/>
+        <w:sz w:val="20"/>
+      </w:rPr>
+    </w:lvl>
+    <w:lvl w:ilvl="4" w:tentative="1">
+      <w:start w:val="1"/>
+      <w:numFmt w:val="bullet"/>
+      <w:lvlText w:val=""/>
+      <w:lvlJc w:val="left"/>
+      <w:pPr>
+        <w:tabs>
+          <w:tab w:val="num" w:pos="3600"/>
+        </w:tabs>
+        <w:ind w:left="3600" w:hanging="360"/>
+      </w:pPr>
+      <w:rPr>
+        <w:rFonts w:ascii="Wingdings" w:hAnsi="Wingdings" w:hint="default"/>
+        <w:sz w:val="20"/>
+      </w:rPr>
+    </w:lvl>
+    <w:lvl w:ilvl="5" w:tentative="1">
+      <w:start w:val="1"/>
+      <w:numFmt w:val="bullet"/>
+      <w:lvlText w:val=""/>
+      <w:lvlJc w:val="left"/>
+      <w:pPr>
+        <w:tabs>
+          <w:tab w:val="num" w:pos="4320"/>
+        </w:tabs>
+        <w:ind w:left="4320" w:hanging="360"/>
+      </w:pPr>
+      <w:rPr>
+        <w:rFonts w:ascii="Wingdings" w:hAnsi="Wingdings" w:hint="default"/>
+        <w:sz w:val="20"/>
+      </w:rPr>
+    </w:lvl>
+    <w:lvl w:ilvl="6" w:tentative="1">
+      <w:start w:val="1"/>
+      <w:numFmt w:val="bullet"/>
+      <w:lvlText w:val=""/>
+      <w:lvlJc w:val="left"/>
+      <w:pPr>
+        <w:tabs>
+          <w:tab w:val="num" w:pos="5040"/>
+        </w:tabs>
+        <w:ind w:left="5040" w:hanging="360"/>
+      </w:pPr>
+      <w:rPr>
+        <w:rFonts w:ascii="Wingdings" w:hAnsi="Wingdings" w:hint="default"/>
+        <w:sz w:val="20"/>
+      </w:rPr>
+    </w:lvl>
+    <w:lvl w:ilvl="7" w:tentative="1">
+      <w:start w:val="1"/>
+      <w:numFmt w:val="bullet"/>
+      <w:lvlText w:val=""/>
+      <w:lvlJc w:val="left"/>
+      <w:pPr>
+        <w:tabs>
+          <w:tab w:val="num" w:pos="5760"/>
+        </w:tabs>
+        <w:ind w:left="5760" w:hanging="360"/>
+      </w:pPr>
+      <w:rPr>
+        <w:rFonts w:ascii="Wingdings" w:hAnsi="Wingdings" w:hint="default"/>
+        <w:sz w:val="20"/>
+      </w:rPr>
+    </w:lvl>
+    <w:lvl w:ilvl="8" w:tentative="1">
+      <w:start w:val="1"/>
+      <w:numFmt w:val="bullet"/>
+      <w:lvlText w:val=""/>
+      <w:lvlJc w:val="left"/>
+      <w:pPr>
+        <w:tabs>
+          <w:tab w:val="num" w:pos="6480"/>
+        </w:tabs>
+        <w:ind w:left="6480" w:hanging="360"/>
+      </w:pPr>
+      <w:rPr>
+        <w:rFonts w:ascii="Wingdings" w:hAnsi="Wingdings" w:hint="default"/>
+        <w:sz w:val="20"/>
+      </w:rPr>
+    </w:lvl>
+  </w:abstractNum>
+  <w:abstractNum w:abstractNumId="10" w15:restartNumberingAfterBreak="0">
+    <w:nsid w:val="2465657E"/>
+    <w:multiLevelType w:val="multilevel"/>
+    <w:tmpl w:val="D346BD72"/>
+    <w:lvl w:ilvl="0">
+      <w:start w:val="1"/>
+      <w:numFmt w:val="bullet"/>
+      <w:lvlText w:val=""/>
+      <w:lvlJc w:val="left"/>
+      <w:pPr>
+        <w:tabs>
+          <w:tab w:val="num" w:pos="720"/>
+        </w:tabs>
+        <w:ind w:left="720" w:hanging="360"/>
+      </w:pPr>
+      <w:rPr>
+        <w:rFonts w:ascii="Symbol" w:hAnsi="Symbol" w:hint="default"/>
+        <w:sz w:val="20"/>
+      </w:rPr>
+    </w:lvl>
+    <w:lvl w:ilvl="1">
+      <w:start w:val="1"/>
+      <w:numFmt w:val="decimal"/>
+      <w:lvlText w:val="%2."/>
+      <w:lvlJc w:val="left"/>
+      <w:pPr>
+        <w:tabs>
+          <w:tab w:val="num" w:pos="1440"/>
+        </w:tabs>
+        <w:ind w:left="1440" w:hanging="360"/>
+      </w:pPr>
+    </w:lvl>
+    <w:lvl w:ilvl="2" w:tentative="1">
+      <w:start w:val="1"/>
+      <w:numFmt w:val="bullet"/>
+      <w:lvlText w:val=""/>
+      <w:lvlJc w:val="left"/>
+      <w:pPr>
+        <w:tabs>
+          <w:tab w:val="num" w:pos="2160"/>
+        </w:tabs>
+        <w:ind w:left="2160" w:hanging="360"/>
+      </w:pPr>
+      <w:rPr>
+        <w:rFonts w:ascii="Wingdings" w:hAnsi="Wingdings" w:hint="default"/>
+        <w:sz w:val="20"/>
+      </w:rPr>
+    </w:lvl>
+    <w:lvl w:ilvl="3" w:tentative="1">
+      <w:start w:val="1"/>
+      <w:numFmt w:val="bullet"/>
+      <w:lvlText w:val=""/>
+      <w:lvlJc w:val="left"/>
+      <w:pPr>
+        <w:tabs>
+          <w:tab w:val="num" w:pos="2880"/>
+        </w:tabs>
+        <w:ind w:left="2880" w:hanging="360"/>
+      </w:pPr>
+      <w:rPr>
+        <w:rFonts w:ascii="Wingdings" w:hAnsi="Wingdings" w:hint="default"/>
+        <w:sz w:val="20"/>
+      </w:rPr>
+    </w:lvl>
+    <w:lvl w:ilvl="4" w:tentative="1">
+      <w:start w:val="1"/>
+      <w:numFmt w:val="bullet"/>
+      <w:lvlText w:val=""/>
+      <w:lvlJc w:val="left"/>
+      <w:pPr>
+        <w:tabs>
+          <w:tab w:val="num" w:pos="3600"/>
+        </w:tabs>
+        <w:ind w:left="3600" w:hanging="360"/>
+      </w:pPr>
+      <w:rPr>
+        <w:rFonts w:ascii="Wingdings" w:hAnsi="Wingdings" w:hint="default"/>
+        <w:sz w:val="20"/>
+      </w:rPr>
+    </w:lvl>
+    <w:lvl w:ilvl="5" w:tentative="1">
+      <w:start w:val="1"/>
+      <w:numFmt w:val="bullet"/>
+      <w:lvlText w:val=""/>
+      <w:lvlJc w:val="left"/>
+      <w:pPr>
+        <w:tabs>
+          <w:tab w:val="num" w:pos="4320"/>
+        </w:tabs>
+        <w:ind w:left="4320" w:hanging="360"/>
+      </w:pPr>
+      <w:rPr>
+        <w:rFonts w:ascii="Wingdings" w:hAnsi="Wingdings" w:hint="default"/>
+        <w:sz w:val="20"/>
+      </w:rPr>
+    </w:lvl>
+    <w:lvl w:ilvl="6" w:tentative="1">
+      <w:start w:val="1"/>
+      <w:numFmt w:val="bullet"/>
+      <w:lvlText w:val=""/>
+      <w:lvlJc w:val="left"/>
+      <w:pPr>
+        <w:tabs>
+          <w:tab w:val="num" w:pos="5040"/>
+        </w:tabs>
+        <w:ind w:left="5040" w:hanging="360"/>
+      </w:pPr>
+      <w:rPr>
+        <w:rFonts w:ascii="Wingdings" w:hAnsi="Wingdings" w:hint="default"/>
+        <w:sz w:val="20"/>
+      </w:rPr>
+    </w:lvl>
+    <w:lvl w:ilvl="7" w:tentative="1">
+      <w:start w:val="1"/>
+      <w:numFmt w:val="bullet"/>
+      <w:lvlText w:val=""/>
+      <w:lvlJc w:val="left"/>
+      <w:pPr>
+        <w:tabs>
+          <w:tab w:val="num" w:pos="5760"/>
+        </w:tabs>
+        <w:ind w:left="5760" w:hanging="360"/>
+      </w:pPr>
+      <w:rPr>
+        <w:rFonts w:ascii="Wingdings" w:hAnsi="Wingdings" w:hint="default"/>
+        <w:sz w:val="20"/>
+      </w:rPr>
+    </w:lvl>
+    <w:lvl w:ilvl="8" w:tentative="1">
+      <w:start w:val="1"/>
+      <w:numFmt w:val="bullet"/>
+      <w:lvlText w:val=""/>
+      <w:lvlJc w:val="left"/>
+      <w:pPr>
+        <w:tabs>
+          <w:tab w:val="num" w:pos="6480"/>
+        </w:tabs>
+        <w:ind w:left="6480" w:hanging="360"/>
+      </w:pPr>
+      <w:rPr>
+        <w:rFonts w:ascii="Wingdings" w:hAnsi="Wingdings" w:hint="default"/>
+        <w:sz w:val="20"/>
+      </w:rPr>
+    </w:lvl>
+  </w:abstractNum>
+  <w:abstractNum w:abstractNumId="11" w15:restartNumberingAfterBreak="0">
     <w:nsid w:val="2C4517CC"/>
     <w:multiLevelType w:val="multilevel"/>
     <w:tmpl w:val="5DA27FC4"/>
@@ -5087,7 +8824,297 @@
       </w:rPr>
     </w:lvl>
   </w:abstractNum>
-  <w:abstractNum w:abstractNumId="7" w15:restartNumberingAfterBreak="0">
+  <w:abstractNum w:abstractNumId="12" w15:restartNumberingAfterBreak="0">
+    <w:nsid w:val="2E47190D"/>
+    <w:multiLevelType w:val="multilevel"/>
+    <w:tmpl w:val="68329F62"/>
+    <w:lvl w:ilvl="0">
+      <w:start w:val="1"/>
+      <w:numFmt w:val="bullet"/>
+      <w:lvlText w:val=""/>
+      <w:lvlJc w:val="left"/>
+      <w:pPr>
+        <w:tabs>
+          <w:tab w:val="num" w:pos="720"/>
+        </w:tabs>
+        <w:ind w:left="720" w:hanging="360"/>
+      </w:pPr>
+      <w:rPr>
+        <w:rFonts w:ascii="Symbol" w:hAnsi="Symbol" w:hint="default"/>
+        <w:sz w:val="20"/>
+      </w:rPr>
+    </w:lvl>
+    <w:lvl w:ilvl="1">
+      <w:start w:val="1"/>
+      <w:numFmt w:val="decimal"/>
+      <w:lvlText w:val="%2."/>
+      <w:lvlJc w:val="left"/>
+      <w:pPr>
+        <w:tabs>
+          <w:tab w:val="num" w:pos="1440"/>
+        </w:tabs>
+        <w:ind w:left="1440" w:hanging="360"/>
+      </w:pPr>
+    </w:lvl>
+    <w:lvl w:ilvl="2" w:tentative="1">
+      <w:start w:val="1"/>
+      <w:numFmt w:val="bullet"/>
+      <w:lvlText w:val=""/>
+      <w:lvlJc w:val="left"/>
+      <w:pPr>
+        <w:tabs>
+          <w:tab w:val="num" w:pos="2160"/>
+        </w:tabs>
+        <w:ind w:left="2160" w:hanging="360"/>
+      </w:pPr>
+      <w:rPr>
+        <w:rFonts w:ascii="Wingdings" w:hAnsi="Wingdings" w:hint="default"/>
+        <w:sz w:val="20"/>
+      </w:rPr>
+    </w:lvl>
+    <w:lvl w:ilvl="3" w:tentative="1">
+      <w:start w:val="1"/>
+      <w:numFmt w:val="bullet"/>
+      <w:lvlText w:val=""/>
+      <w:lvlJc w:val="left"/>
+      <w:pPr>
+        <w:tabs>
+          <w:tab w:val="num" w:pos="2880"/>
+        </w:tabs>
+        <w:ind w:left="2880" w:hanging="360"/>
+      </w:pPr>
+      <w:rPr>
+        <w:rFonts w:ascii="Wingdings" w:hAnsi="Wingdings" w:hint="default"/>
+        <w:sz w:val="20"/>
+      </w:rPr>
+    </w:lvl>
+    <w:lvl w:ilvl="4" w:tentative="1">
+      <w:start w:val="1"/>
+      <w:numFmt w:val="bullet"/>
+      <w:lvlText w:val=""/>
+      <w:lvlJc w:val="left"/>
+      <w:pPr>
+        <w:tabs>
+          <w:tab w:val="num" w:pos="3600"/>
+        </w:tabs>
+        <w:ind w:left="3600" w:hanging="360"/>
+      </w:pPr>
+      <w:rPr>
+        <w:rFonts w:ascii="Wingdings" w:hAnsi="Wingdings" w:hint="default"/>
+        <w:sz w:val="20"/>
+      </w:rPr>
+    </w:lvl>
+    <w:lvl w:ilvl="5" w:tentative="1">
+      <w:start w:val="1"/>
+      <w:numFmt w:val="bullet"/>
+      <w:lvlText w:val=""/>
+      <w:lvlJc w:val="left"/>
+      <w:pPr>
+        <w:tabs>
+          <w:tab w:val="num" w:pos="4320"/>
+        </w:tabs>
+        <w:ind w:left="4320" w:hanging="360"/>
+      </w:pPr>
+      <w:rPr>
+        <w:rFonts w:ascii="Wingdings" w:hAnsi="Wingdings" w:hint="default"/>
+        <w:sz w:val="20"/>
+      </w:rPr>
+    </w:lvl>
+    <w:lvl w:ilvl="6" w:tentative="1">
+      <w:start w:val="1"/>
+      <w:numFmt w:val="bullet"/>
+      <w:lvlText w:val=""/>
+      <w:lvlJc w:val="left"/>
+      <w:pPr>
+        <w:tabs>
+          <w:tab w:val="num" w:pos="5040"/>
+        </w:tabs>
+        <w:ind w:left="5040" w:hanging="360"/>
+      </w:pPr>
+      <w:rPr>
+        <w:rFonts w:ascii="Wingdings" w:hAnsi="Wingdings" w:hint="default"/>
+        <w:sz w:val="20"/>
+      </w:rPr>
+    </w:lvl>
+    <w:lvl w:ilvl="7" w:tentative="1">
+      <w:start w:val="1"/>
+      <w:numFmt w:val="bullet"/>
+      <w:lvlText w:val=""/>
+      <w:lvlJc w:val="left"/>
+      <w:pPr>
+        <w:tabs>
+          <w:tab w:val="num" w:pos="5760"/>
+        </w:tabs>
+        <w:ind w:left="5760" w:hanging="360"/>
+      </w:pPr>
+      <w:rPr>
+        <w:rFonts w:ascii="Wingdings" w:hAnsi="Wingdings" w:hint="default"/>
+        <w:sz w:val="20"/>
+      </w:rPr>
+    </w:lvl>
+    <w:lvl w:ilvl="8" w:tentative="1">
+      <w:start w:val="1"/>
+      <w:numFmt w:val="bullet"/>
+      <w:lvlText w:val=""/>
+      <w:lvlJc w:val="left"/>
+      <w:pPr>
+        <w:tabs>
+          <w:tab w:val="num" w:pos="6480"/>
+        </w:tabs>
+        <w:ind w:left="6480" w:hanging="360"/>
+      </w:pPr>
+      <w:rPr>
+        <w:rFonts w:ascii="Wingdings" w:hAnsi="Wingdings" w:hint="default"/>
+        <w:sz w:val="20"/>
+      </w:rPr>
+    </w:lvl>
+  </w:abstractNum>
+  <w:abstractNum w:abstractNumId="13" w15:restartNumberingAfterBreak="0">
+    <w:nsid w:val="351F19EB"/>
+    <w:multiLevelType w:val="multilevel"/>
+    <w:tmpl w:val="0CFA4F8C"/>
+    <w:lvl w:ilvl="0">
+      <w:start w:val="1"/>
+      <w:numFmt w:val="bullet"/>
+      <w:lvlText w:val=""/>
+      <w:lvlJc w:val="left"/>
+      <w:pPr>
+        <w:tabs>
+          <w:tab w:val="num" w:pos="720"/>
+        </w:tabs>
+        <w:ind w:left="720" w:hanging="360"/>
+      </w:pPr>
+      <w:rPr>
+        <w:rFonts w:ascii="Symbol" w:hAnsi="Symbol" w:hint="default"/>
+        <w:sz w:val="20"/>
+      </w:rPr>
+    </w:lvl>
+    <w:lvl w:ilvl="1">
+      <w:start w:val="1"/>
+      <w:numFmt w:val="decimal"/>
+      <w:lvlText w:val="%2."/>
+      <w:lvlJc w:val="left"/>
+      <w:pPr>
+        <w:tabs>
+          <w:tab w:val="num" w:pos="1440"/>
+        </w:tabs>
+        <w:ind w:left="1440" w:hanging="360"/>
+      </w:pPr>
+    </w:lvl>
+    <w:lvl w:ilvl="2" w:tentative="1">
+      <w:start w:val="1"/>
+      <w:numFmt w:val="bullet"/>
+      <w:lvlText w:val=""/>
+      <w:lvlJc w:val="left"/>
+      <w:pPr>
+        <w:tabs>
+          <w:tab w:val="num" w:pos="2160"/>
+        </w:tabs>
+        <w:ind w:left="2160" w:hanging="360"/>
+      </w:pPr>
+      <w:rPr>
+        <w:rFonts w:ascii="Wingdings" w:hAnsi="Wingdings" w:hint="default"/>
+        <w:sz w:val="20"/>
+      </w:rPr>
+    </w:lvl>
+    <w:lvl w:ilvl="3" w:tentative="1">
+      <w:start w:val="1"/>
+      <w:numFmt w:val="bullet"/>
+      <w:lvlText w:val=""/>
+      <w:lvlJc w:val="left"/>
+      <w:pPr>
+        <w:tabs>
+          <w:tab w:val="num" w:pos="2880"/>
+        </w:tabs>
+        <w:ind w:left="2880" w:hanging="360"/>
+      </w:pPr>
+      <w:rPr>
+        <w:rFonts w:ascii="Wingdings" w:hAnsi="Wingdings" w:hint="default"/>
+        <w:sz w:val="20"/>
+      </w:rPr>
+    </w:lvl>
+    <w:lvl w:ilvl="4" w:tentative="1">
+      <w:start w:val="1"/>
+      <w:numFmt w:val="bullet"/>
+      <w:lvlText w:val=""/>
+      <w:lvlJc w:val="left"/>
+      <w:pPr>
+        <w:tabs>
+          <w:tab w:val="num" w:pos="3600"/>
+        </w:tabs>
+        <w:ind w:left="3600" w:hanging="360"/>
+      </w:pPr>
+      <w:rPr>
+        <w:rFonts w:ascii="Wingdings" w:hAnsi="Wingdings" w:hint="default"/>
+        <w:sz w:val="20"/>
+      </w:rPr>
+    </w:lvl>
+    <w:lvl w:ilvl="5" w:tentative="1">
+      <w:start w:val="1"/>
+      <w:numFmt w:val="bullet"/>
+      <w:lvlText w:val=""/>
+      <w:lvlJc w:val="left"/>
+      <w:pPr>
+        <w:tabs>
+          <w:tab w:val="num" w:pos="4320"/>
+        </w:tabs>
+        <w:ind w:left="4320" w:hanging="360"/>
+      </w:pPr>
+      <w:rPr>
+        <w:rFonts w:ascii="Wingdings" w:hAnsi="Wingdings" w:hint="default"/>
+        <w:sz w:val="20"/>
+      </w:rPr>
+    </w:lvl>
+    <w:lvl w:ilvl="6" w:tentative="1">
+      <w:start w:val="1"/>
+      <w:numFmt w:val="bullet"/>
+      <w:lvlText w:val=""/>
+      <w:lvlJc w:val="left"/>
+      <w:pPr>
+        <w:tabs>
+          <w:tab w:val="num" w:pos="5040"/>
+        </w:tabs>
+        <w:ind w:left="5040" w:hanging="360"/>
+      </w:pPr>
+      <w:rPr>
+        <w:rFonts w:ascii="Wingdings" w:hAnsi="Wingdings" w:hint="default"/>
+        <w:sz w:val="20"/>
+      </w:rPr>
+    </w:lvl>
+    <w:lvl w:ilvl="7" w:tentative="1">
+      <w:start w:val="1"/>
+      <w:numFmt w:val="bullet"/>
+      <w:lvlText w:val=""/>
+      <w:lvlJc w:val="left"/>
+      <w:pPr>
+        <w:tabs>
+          <w:tab w:val="num" w:pos="5760"/>
+        </w:tabs>
+        <w:ind w:left="5760" w:hanging="360"/>
+      </w:pPr>
+      <w:rPr>
+        <w:rFonts w:ascii="Wingdings" w:hAnsi="Wingdings" w:hint="default"/>
+        <w:sz w:val="20"/>
+      </w:rPr>
+    </w:lvl>
+    <w:lvl w:ilvl="8" w:tentative="1">
+      <w:start w:val="1"/>
+      <w:numFmt w:val="bullet"/>
+      <w:lvlText w:val=""/>
+      <w:lvlJc w:val="left"/>
+      <w:pPr>
+        <w:tabs>
+          <w:tab w:val="num" w:pos="6480"/>
+        </w:tabs>
+        <w:ind w:left="6480" w:hanging="360"/>
+      </w:pPr>
+      <w:rPr>
+        <w:rFonts w:ascii="Wingdings" w:hAnsi="Wingdings" w:hint="default"/>
+        <w:sz w:val="20"/>
+      </w:rPr>
+    </w:lvl>
+  </w:abstractNum>
+  <w:abstractNum w:abstractNumId="14" w15:restartNumberingAfterBreak="0">
     <w:nsid w:val="35985041"/>
     <w:multiLevelType w:val="multilevel"/>
     <w:tmpl w:val="2E62EEBC"/>
@@ -5232,7 +9259,7 @@
       </w:rPr>
     </w:lvl>
   </w:abstractNum>
-  <w:abstractNum w:abstractNumId="8" w15:restartNumberingAfterBreak="0">
+  <w:abstractNum w:abstractNumId="15" w15:restartNumberingAfterBreak="0">
     <w:nsid w:val="3C426972"/>
     <w:multiLevelType w:val="multilevel"/>
     <w:tmpl w:val="FE243A96"/>
@@ -5377,7 +9404,7 @@
       </w:rPr>
     </w:lvl>
   </w:abstractNum>
-  <w:abstractNum w:abstractNumId="9" w15:restartNumberingAfterBreak="0">
+  <w:abstractNum w:abstractNumId="16" w15:restartNumberingAfterBreak="0">
     <w:nsid w:val="3F79518B"/>
     <w:multiLevelType w:val="multilevel"/>
     <w:tmpl w:val="FCA02F12"/>
@@ -5522,7 +9549,7 @@
       </w:rPr>
     </w:lvl>
   </w:abstractNum>
-  <w:abstractNum w:abstractNumId="10" w15:restartNumberingAfterBreak="0">
+  <w:abstractNum w:abstractNumId="17" w15:restartNumberingAfterBreak="0">
     <w:nsid w:val="4D4102D7"/>
     <w:multiLevelType w:val="multilevel"/>
     <w:tmpl w:val="1DD4CF32"/>
@@ -5667,7 +9694,7 @@
       </w:rPr>
     </w:lvl>
   </w:abstractNum>
-  <w:abstractNum w:abstractNumId="11" w15:restartNumberingAfterBreak="0">
+  <w:abstractNum w:abstractNumId="18" w15:restartNumberingAfterBreak="0">
     <w:nsid w:val="4D5E4B43"/>
     <w:multiLevelType w:val="multilevel"/>
     <w:tmpl w:val="0316A0E8"/>
@@ -5812,7 +9839,7 @@
       </w:rPr>
     </w:lvl>
   </w:abstractNum>
-  <w:abstractNum w:abstractNumId="12" w15:restartNumberingAfterBreak="0">
+  <w:abstractNum w:abstractNumId="19" w15:restartNumberingAfterBreak="0">
     <w:nsid w:val="4E5025FC"/>
     <w:multiLevelType w:val="multilevel"/>
     <w:tmpl w:val="DBEECC6C"/>
@@ -5961,7 +9988,297 @@
       </w:rPr>
     </w:lvl>
   </w:abstractNum>
-  <w:abstractNum w:abstractNumId="13" w15:restartNumberingAfterBreak="0">
+  <w:abstractNum w:abstractNumId="20" w15:restartNumberingAfterBreak="0">
+    <w:nsid w:val="56000789"/>
+    <w:multiLevelType w:val="multilevel"/>
+    <w:tmpl w:val="A8B23096"/>
+    <w:lvl w:ilvl="0">
+      <w:start w:val="1"/>
+      <w:numFmt w:val="bullet"/>
+      <w:lvlText w:val=""/>
+      <w:lvlJc w:val="left"/>
+      <w:pPr>
+        <w:tabs>
+          <w:tab w:val="num" w:pos="720"/>
+        </w:tabs>
+        <w:ind w:left="720" w:hanging="360"/>
+      </w:pPr>
+      <w:rPr>
+        <w:rFonts w:ascii="Symbol" w:hAnsi="Symbol" w:hint="default"/>
+        <w:sz w:val="20"/>
+      </w:rPr>
+    </w:lvl>
+    <w:lvl w:ilvl="1">
+      <w:start w:val="1"/>
+      <w:numFmt w:val="decimal"/>
+      <w:lvlText w:val="%2."/>
+      <w:lvlJc w:val="left"/>
+      <w:pPr>
+        <w:tabs>
+          <w:tab w:val="num" w:pos="1440"/>
+        </w:tabs>
+        <w:ind w:left="1440" w:hanging="360"/>
+      </w:pPr>
+    </w:lvl>
+    <w:lvl w:ilvl="2" w:tentative="1">
+      <w:start w:val="1"/>
+      <w:numFmt w:val="bullet"/>
+      <w:lvlText w:val=""/>
+      <w:lvlJc w:val="left"/>
+      <w:pPr>
+        <w:tabs>
+          <w:tab w:val="num" w:pos="2160"/>
+        </w:tabs>
+        <w:ind w:left="2160" w:hanging="360"/>
+      </w:pPr>
+      <w:rPr>
+        <w:rFonts w:ascii="Wingdings" w:hAnsi="Wingdings" w:hint="default"/>
+        <w:sz w:val="20"/>
+      </w:rPr>
+    </w:lvl>
+    <w:lvl w:ilvl="3" w:tentative="1">
+      <w:start w:val="1"/>
+      <w:numFmt w:val="bullet"/>
+      <w:lvlText w:val=""/>
+      <w:lvlJc w:val="left"/>
+      <w:pPr>
+        <w:tabs>
+          <w:tab w:val="num" w:pos="2880"/>
+        </w:tabs>
+        <w:ind w:left="2880" w:hanging="360"/>
+      </w:pPr>
+      <w:rPr>
+        <w:rFonts w:ascii="Wingdings" w:hAnsi="Wingdings" w:hint="default"/>
+        <w:sz w:val="20"/>
+      </w:rPr>
+    </w:lvl>
+    <w:lvl w:ilvl="4" w:tentative="1">
+      <w:start w:val="1"/>
+      <w:numFmt w:val="bullet"/>
+      <w:lvlText w:val=""/>
+      <w:lvlJc w:val="left"/>
+      <w:pPr>
+        <w:tabs>
+          <w:tab w:val="num" w:pos="3600"/>
+        </w:tabs>
+        <w:ind w:left="3600" w:hanging="360"/>
+      </w:pPr>
+      <w:rPr>
+        <w:rFonts w:ascii="Wingdings" w:hAnsi="Wingdings" w:hint="default"/>
+        <w:sz w:val="20"/>
+      </w:rPr>
+    </w:lvl>
+    <w:lvl w:ilvl="5" w:tentative="1">
+      <w:start w:val="1"/>
+      <w:numFmt w:val="bullet"/>
+      <w:lvlText w:val=""/>
+      <w:lvlJc w:val="left"/>
+      <w:pPr>
+        <w:tabs>
+          <w:tab w:val="num" w:pos="4320"/>
+        </w:tabs>
+        <w:ind w:left="4320" w:hanging="360"/>
+      </w:pPr>
+      <w:rPr>
+        <w:rFonts w:ascii="Wingdings" w:hAnsi="Wingdings" w:hint="default"/>
+        <w:sz w:val="20"/>
+      </w:rPr>
+    </w:lvl>
+    <w:lvl w:ilvl="6" w:tentative="1">
+      <w:start w:val="1"/>
+      <w:numFmt w:val="bullet"/>
+      <w:lvlText w:val=""/>
+      <w:lvlJc w:val="left"/>
+      <w:pPr>
+        <w:tabs>
+          <w:tab w:val="num" w:pos="5040"/>
+        </w:tabs>
+        <w:ind w:left="5040" w:hanging="360"/>
+      </w:pPr>
+      <w:rPr>
+        <w:rFonts w:ascii="Wingdings" w:hAnsi="Wingdings" w:hint="default"/>
+        <w:sz w:val="20"/>
+      </w:rPr>
+    </w:lvl>
+    <w:lvl w:ilvl="7" w:tentative="1">
+      <w:start w:val="1"/>
+      <w:numFmt w:val="bullet"/>
+      <w:lvlText w:val=""/>
+      <w:lvlJc w:val="left"/>
+      <w:pPr>
+        <w:tabs>
+          <w:tab w:val="num" w:pos="5760"/>
+        </w:tabs>
+        <w:ind w:left="5760" w:hanging="360"/>
+      </w:pPr>
+      <w:rPr>
+        <w:rFonts w:ascii="Wingdings" w:hAnsi="Wingdings" w:hint="default"/>
+        <w:sz w:val="20"/>
+      </w:rPr>
+    </w:lvl>
+    <w:lvl w:ilvl="8" w:tentative="1">
+      <w:start w:val="1"/>
+      <w:numFmt w:val="bullet"/>
+      <w:lvlText w:val=""/>
+      <w:lvlJc w:val="left"/>
+      <w:pPr>
+        <w:tabs>
+          <w:tab w:val="num" w:pos="6480"/>
+        </w:tabs>
+        <w:ind w:left="6480" w:hanging="360"/>
+      </w:pPr>
+      <w:rPr>
+        <w:rFonts w:ascii="Wingdings" w:hAnsi="Wingdings" w:hint="default"/>
+        <w:sz w:val="20"/>
+      </w:rPr>
+    </w:lvl>
+  </w:abstractNum>
+  <w:abstractNum w:abstractNumId="21" w15:restartNumberingAfterBreak="0">
+    <w:nsid w:val="630E610A"/>
+    <w:multiLevelType w:val="multilevel"/>
+    <w:tmpl w:val="EEFCF986"/>
+    <w:lvl w:ilvl="0">
+      <w:start w:val="1"/>
+      <w:numFmt w:val="bullet"/>
+      <w:lvlText w:val=""/>
+      <w:lvlJc w:val="left"/>
+      <w:pPr>
+        <w:tabs>
+          <w:tab w:val="num" w:pos="720"/>
+        </w:tabs>
+        <w:ind w:left="720" w:hanging="360"/>
+      </w:pPr>
+      <w:rPr>
+        <w:rFonts w:ascii="Symbol" w:hAnsi="Symbol" w:hint="default"/>
+        <w:sz w:val="20"/>
+      </w:rPr>
+    </w:lvl>
+    <w:lvl w:ilvl="1">
+      <w:start w:val="1"/>
+      <w:numFmt w:val="decimal"/>
+      <w:lvlText w:val="%2."/>
+      <w:lvlJc w:val="left"/>
+      <w:pPr>
+        <w:tabs>
+          <w:tab w:val="num" w:pos="1440"/>
+        </w:tabs>
+        <w:ind w:left="1440" w:hanging="360"/>
+      </w:pPr>
+    </w:lvl>
+    <w:lvl w:ilvl="2" w:tentative="1">
+      <w:start w:val="1"/>
+      <w:numFmt w:val="bullet"/>
+      <w:lvlText w:val=""/>
+      <w:lvlJc w:val="left"/>
+      <w:pPr>
+        <w:tabs>
+          <w:tab w:val="num" w:pos="2160"/>
+        </w:tabs>
+        <w:ind w:left="2160" w:hanging="360"/>
+      </w:pPr>
+      <w:rPr>
+        <w:rFonts w:ascii="Wingdings" w:hAnsi="Wingdings" w:hint="default"/>
+        <w:sz w:val="20"/>
+      </w:rPr>
+    </w:lvl>
+    <w:lvl w:ilvl="3" w:tentative="1">
+      <w:start w:val="1"/>
+      <w:numFmt w:val="bullet"/>
+      <w:lvlText w:val=""/>
+      <w:lvlJc w:val="left"/>
+      <w:pPr>
+        <w:tabs>
+          <w:tab w:val="num" w:pos="2880"/>
+        </w:tabs>
+        <w:ind w:left="2880" w:hanging="360"/>
+      </w:pPr>
+      <w:rPr>
+        <w:rFonts w:ascii="Wingdings" w:hAnsi="Wingdings" w:hint="default"/>
+        <w:sz w:val="20"/>
+      </w:rPr>
+    </w:lvl>
+    <w:lvl w:ilvl="4" w:tentative="1">
+      <w:start w:val="1"/>
+      <w:numFmt w:val="bullet"/>
+      <w:lvlText w:val=""/>
+      <w:lvlJc w:val="left"/>
+      <w:pPr>
+        <w:tabs>
+          <w:tab w:val="num" w:pos="3600"/>
+        </w:tabs>
+        <w:ind w:left="3600" w:hanging="360"/>
+      </w:pPr>
+      <w:rPr>
+        <w:rFonts w:ascii="Wingdings" w:hAnsi="Wingdings" w:hint="default"/>
+        <w:sz w:val="20"/>
+      </w:rPr>
+    </w:lvl>
+    <w:lvl w:ilvl="5" w:tentative="1">
+      <w:start w:val="1"/>
+      <w:numFmt w:val="bullet"/>
+      <w:lvlText w:val=""/>
+      <w:lvlJc w:val="left"/>
+      <w:pPr>
+        <w:tabs>
+          <w:tab w:val="num" w:pos="4320"/>
+        </w:tabs>
+        <w:ind w:left="4320" w:hanging="360"/>
+      </w:pPr>
+      <w:rPr>
+        <w:rFonts w:ascii="Wingdings" w:hAnsi="Wingdings" w:hint="default"/>
+        <w:sz w:val="20"/>
+      </w:rPr>
+    </w:lvl>
+    <w:lvl w:ilvl="6" w:tentative="1">
+      <w:start w:val="1"/>
+      <w:numFmt w:val="bullet"/>
+      <w:lvlText w:val=""/>
+      <w:lvlJc w:val="left"/>
+      <w:pPr>
+        <w:tabs>
+          <w:tab w:val="num" w:pos="5040"/>
+        </w:tabs>
+        <w:ind w:left="5040" w:hanging="360"/>
+      </w:pPr>
+      <w:rPr>
+        <w:rFonts w:ascii="Wingdings" w:hAnsi="Wingdings" w:hint="default"/>
+        <w:sz w:val="20"/>
+      </w:rPr>
+    </w:lvl>
+    <w:lvl w:ilvl="7" w:tentative="1">
+      <w:start w:val="1"/>
+      <w:numFmt w:val="bullet"/>
+      <w:lvlText w:val=""/>
+      <w:lvlJc w:val="left"/>
+      <w:pPr>
+        <w:tabs>
+          <w:tab w:val="num" w:pos="5760"/>
+        </w:tabs>
+        <w:ind w:left="5760" w:hanging="360"/>
+      </w:pPr>
+      <w:rPr>
+        <w:rFonts w:ascii="Wingdings" w:hAnsi="Wingdings" w:hint="default"/>
+        <w:sz w:val="20"/>
+      </w:rPr>
+    </w:lvl>
+    <w:lvl w:ilvl="8" w:tentative="1">
+      <w:start w:val="1"/>
+      <w:numFmt w:val="bullet"/>
+      <w:lvlText w:val=""/>
+      <w:lvlJc w:val="left"/>
+      <w:pPr>
+        <w:tabs>
+          <w:tab w:val="num" w:pos="6480"/>
+        </w:tabs>
+        <w:ind w:left="6480" w:hanging="360"/>
+      </w:pPr>
+      <w:rPr>
+        <w:rFonts w:ascii="Wingdings" w:hAnsi="Wingdings" w:hint="default"/>
+        <w:sz w:val="20"/>
+      </w:rPr>
+    </w:lvl>
+  </w:abstractNum>
+  <w:abstractNum w:abstractNumId="22" w15:restartNumberingAfterBreak="0">
     <w:nsid w:val="6CC75F48"/>
     <w:multiLevelType w:val="multilevel"/>
     <w:tmpl w:val="463E21F6"/>
@@ -6106,7 +10423,152 @@
       </w:rPr>
     </w:lvl>
   </w:abstractNum>
-  <w:abstractNum w:abstractNumId="14" w15:restartNumberingAfterBreak="0">
+  <w:abstractNum w:abstractNumId="23" w15:restartNumberingAfterBreak="0">
+    <w:nsid w:val="70B92CB3"/>
+    <w:multiLevelType w:val="multilevel"/>
+    <w:tmpl w:val="38ACA114"/>
+    <w:lvl w:ilvl="0">
+      <w:start w:val="1"/>
+      <w:numFmt w:val="bullet"/>
+      <w:lvlText w:val=""/>
+      <w:lvlJc w:val="left"/>
+      <w:pPr>
+        <w:tabs>
+          <w:tab w:val="num" w:pos="720"/>
+        </w:tabs>
+        <w:ind w:left="720" w:hanging="360"/>
+      </w:pPr>
+      <w:rPr>
+        <w:rFonts w:ascii="Symbol" w:hAnsi="Symbol" w:hint="default"/>
+        <w:sz w:val="20"/>
+      </w:rPr>
+    </w:lvl>
+    <w:lvl w:ilvl="1">
+      <w:start w:val="1"/>
+      <w:numFmt w:val="decimal"/>
+      <w:lvlText w:val="%2."/>
+      <w:lvlJc w:val="left"/>
+      <w:pPr>
+        <w:tabs>
+          <w:tab w:val="num" w:pos="1440"/>
+        </w:tabs>
+        <w:ind w:left="1440" w:hanging="360"/>
+      </w:pPr>
+    </w:lvl>
+    <w:lvl w:ilvl="2" w:tentative="1">
+      <w:start w:val="1"/>
+      <w:numFmt w:val="bullet"/>
+      <w:lvlText w:val=""/>
+      <w:lvlJc w:val="left"/>
+      <w:pPr>
+        <w:tabs>
+          <w:tab w:val="num" w:pos="2160"/>
+        </w:tabs>
+        <w:ind w:left="2160" w:hanging="360"/>
+      </w:pPr>
+      <w:rPr>
+        <w:rFonts w:ascii="Wingdings" w:hAnsi="Wingdings" w:hint="default"/>
+        <w:sz w:val="20"/>
+      </w:rPr>
+    </w:lvl>
+    <w:lvl w:ilvl="3" w:tentative="1">
+      <w:start w:val="1"/>
+      <w:numFmt w:val="bullet"/>
+      <w:lvlText w:val=""/>
+      <w:lvlJc w:val="left"/>
+      <w:pPr>
+        <w:tabs>
+          <w:tab w:val="num" w:pos="2880"/>
+        </w:tabs>
+        <w:ind w:left="2880" w:hanging="360"/>
+      </w:pPr>
+      <w:rPr>
+        <w:rFonts w:ascii="Wingdings" w:hAnsi="Wingdings" w:hint="default"/>
+        <w:sz w:val="20"/>
+      </w:rPr>
+    </w:lvl>
+    <w:lvl w:ilvl="4" w:tentative="1">
+      <w:start w:val="1"/>
+      <w:numFmt w:val="bullet"/>
+      <w:lvlText w:val=""/>
+      <w:lvlJc w:val="left"/>
+      <w:pPr>
+        <w:tabs>
+          <w:tab w:val="num" w:pos="3600"/>
+        </w:tabs>
+        <w:ind w:left="3600" w:hanging="360"/>
+      </w:pPr>
+      <w:rPr>
+        <w:rFonts w:ascii="Wingdings" w:hAnsi="Wingdings" w:hint="default"/>
+        <w:sz w:val="20"/>
+      </w:rPr>
+    </w:lvl>
+    <w:lvl w:ilvl="5" w:tentative="1">
+      <w:start w:val="1"/>
+      <w:numFmt w:val="bullet"/>
+      <w:lvlText w:val=""/>
+      <w:lvlJc w:val="left"/>
+      <w:pPr>
+        <w:tabs>
+          <w:tab w:val="num" w:pos="4320"/>
+        </w:tabs>
+        <w:ind w:left="4320" w:hanging="360"/>
+      </w:pPr>
+      <w:rPr>
+        <w:rFonts w:ascii="Wingdings" w:hAnsi="Wingdings" w:hint="default"/>
+        <w:sz w:val="20"/>
+      </w:rPr>
+    </w:lvl>
+    <w:lvl w:ilvl="6" w:tentative="1">
+      <w:start w:val="1"/>
+      <w:numFmt w:val="bullet"/>
+      <w:lvlText w:val=""/>
+      <w:lvlJc w:val="left"/>
+      <w:pPr>
+        <w:tabs>
+          <w:tab w:val="num" w:pos="5040"/>
+        </w:tabs>
+        <w:ind w:left="5040" w:hanging="360"/>
+      </w:pPr>
+      <w:rPr>
+        <w:rFonts w:ascii="Wingdings" w:hAnsi="Wingdings" w:hint="default"/>
+        <w:sz w:val="20"/>
+      </w:rPr>
+    </w:lvl>
+    <w:lvl w:ilvl="7" w:tentative="1">
+      <w:start w:val="1"/>
+      <w:numFmt w:val="bullet"/>
+      <w:lvlText w:val=""/>
+      <w:lvlJc w:val="left"/>
+      <w:pPr>
+        <w:tabs>
+          <w:tab w:val="num" w:pos="5760"/>
+        </w:tabs>
+        <w:ind w:left="5760" w:hanging="360"/>
+      </w:pPr>
+      <w:rPr>
+        <w:rFonts w:ascii="Wingdings" w:hAnsi="Wingdings" w:hint="default"/>
+        <w:sz w:val="20"/>
+      </w:rPr>
+    </w:lvl>
+    <w:lvl w:ilvl="8" w:tentative="1">
+      <w:start w:val="1"/>
+      <w:numFmt w:val="bullet"/>
+      <w:lvlText w:val=""/>
+      <w:lvlJc w:val="left"/>
+      <w:pPr>
+        <w:tabs>
+          <w:tab w:val="num" w:pos="6480"/>
+        </w:tabs>
+        <w:ind w:left="6480" w:hanging="360"/>
+      </w:pPr>
+      <w:rPr>
+        <w:rFonts w:ascii="Wingdings" w:hAnsi="Wingdings" w:hint="default"/>
+        <w:sz w:val="20"/>
+      </w:rPr>
+    </w:lvl>
+  </w:abstractNum>
+  <w:abstractNum w:abstractNumId="24" w15:restartNumberingAfterBreak="0">
     <w:nsid w:val="737F2372"/>
     <w:multiLevelType w:val="multilevel"/>
     <w:tmpl w:val="EDE28F32"/>
@@ -6255,7 +10717,7 @@
       </w:rPr>
     </w:lvl>
   </w:abstractNum>
-  <w:abstractNum w:abstractNumId="15" w15:restartNumberingAfterBreak="0">
+  <w:abstractNum w:abstractNumId="25" w15:restartNumberingAfterBreak="0">
     <w:nsid w:val="73CA5F71"/>
     <w:multiLevelType w:val="multilevel"/>
     <w:tmpl w:val="823CCA1C"/>
@@ -6404,7 +10866,7 @@
       </w:rPr>
     </w:lvl>
   </w:abstractNum>
-  <w:abstractNum w:abstractNumId="16" w15:restartNumberingAfterBreak="0">
+  <w:abstractNum w:abstractNumId="26" w15:restartNumberingAfterBreak="0">
     <w:nsid w:val="7D661150"/>
     <w:multiLevelType w:val="multilevel"/>
     <w:tmpl w:val="B2C016C6"/>
@@ -6554,55 +11016,85 @@
     </w:lvl>
   </w:abstractNum>
   <w:num w:numId="1" w16cid:durableId="150948612">
+    <w:abstractNumId w:val="25"/>
+  </w:num>
+  <w:num w:numId="2" w16cid:durableId="153691783">
+    <w:abstractNumId w:val="2"/>
+  </w:num>
+  <w:num w:numId="3" w16cid:durableId="2137942363">
+    <w:abstractNumId w:val="19"/>
+  </w:num>
+  <w:num w:numId="4" w16cid:durableId="837384714">
+    <w:abstractNumId w:val="6"/>
+  </w:num>
+  <w:num w:numId="5" w16cid:durableId="1195580079">
+    <w:abstractNumId w:val="5"/>
+  </w:num>
+  <w:num w:numId="6" w16cid:durableId="230584852">
+    <w:abstractNumId w:val="24"/>
+  </w:num>
+  <w:num w:numId="7" w16cid:durableId="2020765144">
+    <w:abstractNumId w:val="11"/>
+  </w:num>
+  <w:num w:numId="8" w16cid:durableId="543174225">
+    <w:abstractNumId w:val="16"/>
+  </w:num>
+  <w:num w:numId="9" w16cid:durableId="1705906635">
+    <w:abstractNumId w:val="3"/>
+  </w:num>
+  <w:num w:numId="10" w16cid:durableId="918907301">
+    <w:abstractNumId w:val="18"/>
+  </w:num>
+  <w:num w:numId="11" w16cid:durableId="1890067325">
     <w:abstractNumId w:val="15"/>
   </w:num>
-  <w:num w:numId="2" w16cid:durableId="153691783">
+  <w:num w:numId="12" w16cid:durableId="739134564">
+    <w:abstractNumId w:val="14"/>
+  </w:num>
+  <w:num w:numId="13" w16cid:durableId="618612604">
+    <w:abstractNumId w:val="22"/>
+  </w:num>
+  <w:num w:numId="14" w16cid:durableId="473569541">
+    <w:abstractNumId w:val="7"/>
+  </w:num>
+  <w:num w:numId="15" w16cid:durableId="661616893">
+    <w:abstractNumId w:val="8"/>
+  </w:num>
+  <w:num w:numId="16" w16cid:durableId="340199764">
+    <w:abstractNumId w:val="17"/>
+  </w:num>
+  <w:num w:numId="17" w16cid:durableId="269092829">
+    <w:abstractNumId w:val="26"/>
+  </w:num>
+  <w:num w:numId="18" w16cid:durableId="424109617">
+    <w:abstractNumId w:val="4"/>
+  </w:num>
+  <w:num w:numId="19" w16cid:durableId="144400197">
+    <w:abstractNumId w:val="23"/>
+  </w:num>
+  <w:num w:numId="20" w16cid:durableId="949356694">
+    <w:abstractNumId w:val="20"/>
+  </w:num>
+  <w:num w:numId="21" w16cid:durableId="80760477">
+    <w:abstractNumId w:val="1"/>
+  </w:num>
+  <w:num w:numId="22" w16cid:durableId="414597647">
+    <w:abstractNumId w:val="21"/>
+  </w:num>
+  <w:num w:numId="23" w16cid:durableId="915552676">
+    <w:abstractNumId w:val="10"/>
+  </w:num>
+  <w:num w:numId="24" w16cid:durableId="500050663">
+    <w:abstractNumId w:val="9"/>
+  </w:num>
+  <w:num w:numId="25" w16cid:durableId="721487287">
     <w:abstractNumId w:val="0"/>
   </w:num>
-  <w:num w:numId="3" w16cid:durableId="2137942363">
+  <w:num w:numId="26" w16cid:durableId="2080320276">
     <w:abstractNumId w:val="12"/>
   </w:num>
-  <w:num w:numId="4" w16cid:durableId="837384714">
-    <w:abstractNumId w:val="3"/>
-  </w:num>
-  <w:num w:numId="5" w16cid:durableId="1195580079">
-    <w:abstractNumId w:val="2"/>
-  </w:num>
-  <w:num w:numId="6" w16cid:durableId="230584852">
-    <w:abstractNumId w:val="14"/>
-  </w:num>
-  <w:num w:numId="7" w16cid:durableId="2020765144">
-    <w:abstractNumId w:val="6"/>
-  </w:num>
-  <w:num w:numId="8" w16cid:durableId="543174225">
-    <w:abstractNumId w:val="9"/>
-  </w:num>
-  <w:num w:numId="9" w16cid:durableId="1705906635">
-    <w:abstractNumId w:val="1"/>
-  </w:num>
-  <w:num w:numId="10" w16cid:durableId="918907301">
-    <w:abstractNumId w:val="11"/>
-  </w:num>
-  <w:num w:numId="11" w16cid:durableId="1890067325">
-    <w:abstractNumId w:val="8"/>
-  </w:num>
-  <w:num w:numId="12" w16cid:durableId="739134564">
-    <w:abstractNumId w:val="7"/>
-  </w:num>
-  <w:num w:numId="13" w16cid:durableId="618612604">
+  <w:num w:numId="27" w16cid:durableId="124155114">
     <w:abstractNumId w:val="13"/>
-  </w:num>
-  <w:num w:numId="14" w16cid:durableId="473569541">
-    <w:abstractNumId w:val="4"/>
-  </w:num>
-  <w:num w:numId="15" w16cid:durableId="661616893">
-    <w:abstractNumId w:val="5"/>
-  </w:num>
-  <w:num w:numId="16" w16cid:durableId="340199764">
-    <w:abstractNumId w:val="10"/>
-  </w:num>
-  <w:num w:numId="17" w16cid:durableId="269092829">
-    <w:abstractNumId w:val="16"/>
   </w:num>
 </w:numbering>
 </file>

</xml_diff>